<commit_message>
paper: update Q1 manuscript drafts, block result documents, and figure generation assets
</commit_message>
<xml_diff>
--- a/docs/block1_complete_results.docx
+++ b/docs/block1_complete_results.docx
@@ -4,11 +4,26 @@
   <w:body>
     <w:p>
       <w:pPr>
+        <w:spacing w:after="80"/>
+        <w:jc w:val="center"/>
+      </w:pPr>
+      <w:r>
+        <w:rPr>
+          <w:rFonts w:ascii="Arial" w:hAnsi="Arial" w:eastAsia="Arial" w:cs="Arial"/>
+          <w:b/>
+          <w:bCs/>
+          <w:color w:val="1F4E79"/>
+          <w:sz w:val="40"/>
+          <w:szCs w:val="40"/>
+        </w:rPr>
+        <w:t>Block 1: Digital Twin Fidelity</w:t>
+      </w:r>
+    </w:p>
+    <w:p>
+      <w:pPr>
         <w:pStyle w:val="2"/>
         <w:spacing w:before="300" w:after="120"/>
       </w:pPr>
-      <w:bookmarkStart w:id="0" w:name="_GoBack"/>
-      <w:bookmarkEnd w:id="0"/>
       <w:r>
         <w:rPr>
           <w:rFonts w:ascii="Arial" w:hAnsi="Arial" w:eastAsia="Arial" w:cs="Arial"/>
@@ -68,6 +83,1003 @@
           <w:szCs w:val="22"/>
         </w:rPr>
         <w:t>When the two surrogates are evaluated as stand-alone reinforcement-learning training environments using a thermostatic PPO controller, the relationship between fidelity and utility inverts: PPO trained on v3 produces live closed-loop temperature RMSE of 0.89 °C on the peak window, while PPO trained on the calibrated v3.5 produces 4.32 °C — a five-fold deterioration despite v3.5 having better one-step physical fidelity. We resolve the paradox with a hybrid backend that rollouts the policy through v3 but adds a frozen-v3.5 disagreement penalty to the PPO loss. This hybrid backend recovers the best of both worlds: live closed-loop RMSE drops to 0.63 °C on the peak window and 0.61 °C on the typical window, while sustaining 1787 environment steps per second (85× the BOPTEST testbed).</w:t>
+      </w:r>
+    </w:p>
+    <w:p>
+      <w:pPr>
+        <w:spacing w:before="240" w:after="120"/>
+      </w:pPr>
+      <w:r>
+        <w:rPr>
+          <w:rFonts w:ascii="Arial" w:hAnsi="Arial" w:eastAsia="Arial" w:cs="Arial"/>
+          <w:b/>
+          <w:bCs/>
+          <w:color w:val="2E75B6"/>
+          <w:sz w:val="24"/>
+          <w:szCs w:val="24"/>
+        </w:rPr>
+        <w:t>Figure-led evidence map</w:t>
+      </w:r>
+    </w:p>
+    <w:p>
+      <w:pPr>
+        <w:spacing w:after="160"/>
+        <w:jc w:val="both"/>
+      </w:pPr>
+      <w:r>
+        <w:rPr>
+          <w:rFonts w:ascii="Arial" w:hAnsi="Arial" w:eastAsia="Arial" w:cs="Arial"/>
+          <w:b w:val="0"/>
+          <w:bCs w:val="0"/>
+          <w:i w:val="0"/>
+          <w:iCs w:val="0"/>
+          <w:sz w:val="22"/>
+          <w:szCs w:val="22"/>
+        </w:rPr>
+        <w:t>For Q1-paper readiness, this dossier no longer treats figures as a detached appendix. The visual evidence is embedded where each claim is made: Stage A/B/C calibration diagnostics in Section 2, multi-horizon predictive validity in Sections 1-2, and the fidelity-to-control gap in Section 4/6. Tables remain as audit artifacts; figures carry the main scientific narrative for reviewer-facing interpretation.</w:t>
+      </w:r>
+    </w:p>
+    <w:p>
+      <w:pPr>
+        <w:spacing w:after="160"/>
+        <w:jc w:val="both"/>
+      </w:pPr>
+      <w:r>
+        <w:rPr>
+          <w:rFonts w:ascii="Arial" w:hAnsi="Arial" w:eastAsia="Arial" w:cs="Arial"/>
+          <w:b w:val="0"/>
+          <w:bCs w:val="0"/>
+          <w:i w:val="0"/>
+          <w:iCs w:val="0"/>
+          <w:sz w:val="22"/>
+          <w:szCs w:val="22"/>
+        </w:rPr>
+        <w:t>To avoid numbering ambiguity in Word, the complete final Q1 figure set is presented below in strict numerical order. The later sections explain the same evidence in detail and provide the tables, source files, and interpretation.</w:t>
+      </w:r>
+    </w:p>
+    <w:p>
+      <w:pPr>
+        <w:spacing w:before="220" w:after="80"/>
+        <w:jc w:val="center"/>
+      </w:pPr>
+      <w:r>
+        <w:drawing>
+          <wp:inline distT="0" distB="0" distL="0" distR="0">
+            <wp:extent cx="5334000" cy="2381250"/>
+            <wp:effectExtent l="0" t="0" r="0" b="0"/>
+            <wp:docPr id="1" name="block1_q1_fig01_pipeline.png" descr="Figure 1. Block 1 experimental pipeline: from surrogate calibration to live BOPTEST validation." title="block1_q1_fig01_pipeline.png"/>
+            <wp:cNvGraphicFramePr>
+              <a:graphicFrameLocks xmlns:a="http://schemas.openxmlformats.org/drawingml/2006/main" noChangeAspect="1"/>
+            </wp:cNvGraphicFramePr>
+            <a:graphic xmlns:a="http://schemas.openxmlformats.org/drawingml/2006/main">
+              <a:graphicData uri="http://schemas.openxmlformats.org/drawingml/2006/picture">
+                <pic:pic xmlns:pic="http://schemas.openxmlformats.org/drawingml/2006/picture">
+                  <pic:nvPicPr>
+                    <pic:cNvPr id="1" name="block1_q1_fig01_pipeline.png" descr="Figure 1. Block 1 experimental pipeline: from surrogate calibration to live BOPTEST validation." title="block1_q1_fig01_pipeline.png"/>
+                    <pic:cNvPicPr>
+                      <a:picLocks noChangeAspect="1" noChangeArrowheads="1"/>
+                    </pic:cNvPicPr>
+                  </pic:nvPicPr>
+                  <pic:blipFill>
+                    <a:blip r:embed="rId6"/>
+                    <a:srcRect/>
+                    <a:stretch>
+                      <a:fillRect/>
+                    </a:stretch>
+                  </pic:blipFill>
+                  <pic:spPr>
+                    <a:xfrm>
+                      <a:off x="0" y="0"/>
+                      <a:ext cx="5334000" cy="2381250"/>
+                    </a:xfrm>
+                    <a:prstGeom prst="rect">
+                      <a:avLst/>
+                    </a:prstGeom>
+                  </pic:spPr>
+                </pic:pic>
+              </a:graphicData>
+            </a:graphic>
+          </wp:inline>
+        </w:drawing>
+      </w:r>
+    </w:p>
+    <w:p>
+      <w:pPr>
+        <w:spacing w:before="80" w:after="200"/>
+        <w:jc w:val="center"/>
+      </w:pPr>
+      <w:r>
+        <w:rPr>
+          <w:rFonts w:ascii="Arial" w:hAnsi="Arial" w:eastAsia="Arial" w:cs="Arial"/>
+          <w:i/>
+          <w:iCs/>
+          <w:color w:val="555555"/>
+          <w:sz w:val="19"/>
+          <w:szCs w:val="19"/>
+        </w:rPr>
+        <w:t>Figure 1. Block 1 experimental pipeline: from surrogate calibration to live BOPTEST validation.</w:t>
+      </w:r>
+    </w:p>
+    <w:p>
+      <w:pPr>
+        <w:spacing w:before="220" w:after="80"/>
+        <w:jc w:val="center"/>
+      </w:pPr>
+      <w:r>
+        <w:drawing>
+          <wp:inline distT="0" distB="0" distL="0" distR="0">
+            <wp:extent cx="5334000" cy="2428875"/>
+            <wp:effectExtent l="0" t="0" r="0" b="0"/>
+            <wp:docPr id="2" name="block1_q1_fig02_v3_dual_head.png" descr="Figure 2. Dual-head architecture of the control-oriented v3 surrogate." title="block1_q1_fig02_v3_dual_head.png"/>
+            <wp:cNvGraphicFramePr>
+              <a:graphicFrameLocks xmlns:a="http://schemas.openxmlformats.org/drawingml/2006/main" noChangeAspect="1"/>
+            </wp:cNvGraphicFramePr>
+            <a:graphic xmlns:a="http://schemas.openxmlformats.org/drawingml/2006/main">
+              <a:graphicData uri="http://schemas.openxmlformats.org/drawingml/2006/picture">
+                <pic:pic xmlns:pic="http://schemas.openxmlformats.org/drawingml/2006/picture">
+                  <pic:nvPicPr>
+                    <pic:cNvPr id="2" name="block1_q1_fig02_v3_dual_head.png" descr="Figure 2. Dual-head architecture of the control-oriented v3 surrogate." title="block1_q1_fig02_v3_dual_head.png"/>
+                    <pic:cNvPicPr>
+                      <a:picLocks noChangeAspect="1" noChangeArrowheads="1"/>
+                    </pic:cNvPicPr>
+                  </pic:nvPicPr>
+                  <pic:blipFill>
+                    <a:blip r:embed="rId7"/>
+                    <a:srcRect/>
+                    <a:stretch>
+                      <a:fillRect/>
+                    </a:stretch>
+                  </pic:blipFill>
+                  <pic:spPr>
+                    <a:xfrm>
+                      <a:off x="0" y="0"/>
+                      <a:ext cx="5334000" cy="2428875"/>
+                    </a:xfrm>
+                    <a:prstGeom prst="rect">
+                      <a:avLst/>
+                    </a:prstGeom>
+                  </pic:spPr>
+                </pic:pic>
+              </a:graphicData>
+            </a:graphic>
+          </wp:inline>
+        </w:drawing>
+      </w:r>
+    </w:p>
+    <w:p>
+      <w:pPr>
+        <w:spacing w:before="80" w:after="200"/>
+        <w:jc w:val="center"/>
+      </w:pPr>
+      <w:r>
+        <w:rPr>
+          <w:rFonts w:ascii="Arial" w:hAnsi="Arial" w:eastAsia="Arial" w:cs="Arial"/>
+          <w:i/>
+          <w:iCs/>
+          <w:color w:val="555555"/>
+          <w:sz w:val="19"/>
+          <w:szCs w:val="19"/>
+        </w:rPr>
+        <w:t>Figure 2. Dual-head architecture of the control-oriented v3 surrogate.</w:t>
+      </w:r>
+    </w:p>
+    <w:p>
+      <w:pPr>
+        <w:spacing w:before="220" w:after="80"/>
+        <w:jc w:val="center"/>
+      </w:pPr>
+      <w:r>
+        <w:drawing>
+          <wp:inline distT="0" distB="0" distL="0" distR="0">
+            <wp:extent cx="5143500" cy="2571750"/>
+            <wp:effectExtent l="0" t="0" r="0" b="0"/>
+            <wp:docPr id="3" name="block1_q1_fig03_stage_abc_improvement.png" descr="Figure 3. Effect of Stage A/B/C inverse calibration on v3.5 predictive fidelity." title="block1_q1_fig03_stage_abc_improvement.png"/>
+            <wp:cNvGraphicFramePr>
+              <a:graphicFrameLocks xmlns:a="http://schemas.openxmlformats.org/drawingml/2006/main" noChangeAspect="1"/>
+            </wp:cNvGraphicFramePr>
+            <a:graphic xmlns:a="http://schemas.openxmlformats.org/drawingml/2006/main">
+              <a:graphicData uri="http://schemas.openxmlformats.org/drawingml/2006/picture">
+                <pic:pic xmlns:pic="http://schemas.openxmlformats.org/drawingml/2006/picture">
+                  <pic:nvPicPr>
+                    <pic:cNvPr id="3" name="block1_q1_fig03_stage_abc_improvement.png" descr="Figure 3. Effect of Stage A/B/C inverse calibration on v3.5 predictive fidelity." title="block1_q1_fig03_stage_abc_improvement.png"/>
+                    <pic:cNvPicPr>
+                      <a:picLocks noChangeAspect="1" noChangeArrowheads="1"/>
+                    </pic:cNvPicPr>
+                  </pic:nvPicPr>
+                  <pic:blipFill>
+                    <a:blip r:embed="rId8"/>
+                    <a:srcRect/>
+                    <a:stretch>
+                      <a:fillRect/>
+                    </a:stretch>
+                  </pic:blipFill>
+                  <pic:spPr>
+                    <a:xfrm>
+                      <a:off x="0" y="0"/>
+                      <a:ext cx="5143500" cy="2571750"/>
+                    </a:xfrm>
+                    <a:prstGeom prst="rect">
+                      <a:avLst/>
+                    </a:prstGeom>
+                  </pic:spPr>
+                </pic:pic>
+              </a:graphicData>
+            </a:graphic>
+          </wp:inline>
+        </w:drawing>
+      </w:r>
+    </w:p>
+    <w:p>
+      <w:pPr>
+        <w:spacing w:before="80" w:after="200"/>
+        <w:jc w:val="center"/>
+      </w:pPr>
+      <w:r>
+        <w:rPr>
+          <w:rFonts w:ascii="Arial" w:hAnsi="Arial" w:eastAsia="Arial" w:cs="Arial"/>
+          <w:i/>
+          <w:iCs/>
+          <w:color w:val="555555"/>
+          <w:sz w:val="19"/>
+          <w:szCs w:val="19"/>
+        </w:rPr>
+        <w:t>Figure 3. Effect of Stage A/B/C inverse calibration on v3.5 predictive fidelity.</w:t>
+      </w:r>
+    </w:p>
+    <w:p>
+      <w:pPr>
+        <w:spacing w:before="220" w:after="80"/>
+        <w:jc w:val="center"/>
+      </w:pPr>
+      <w:r>
+        <w:drawing>
+          <wp:inline distT="0" distB="0" distL="0" distR="0">
+            <wp:extent cx="5143500" cy="2476500"/>
+            <wp:effectExtent l="0" t="0" r="0" b="0"/>
+            <wp:docPr id="4" name="block1_q1_fig04_czon_identification.png" descr="Figure 4. Bayesian inverse identification trajectory of C_zon during Stage B." title="block1_q1_fig04_czon_identification.png"/>
+            <wp:cNvGraphicFramePr>
+              <a:graphicFrameLocks xmlns:a="http://schemas.openxmlformats.org/drawingml/2006/main" noChangeAspect="1"/>
+            </wp:cNvGraphicFramePr>
+            <a:graphic xmlns:a="http://schemas.openxmlformats.org/drawingml/2006/main">
+              <a:graphicData uri="http://schemas.openxmlformats.org/drawingml/2006/picture">
+                <pic:pic xmlns:pic="http://schemas.openxmlformats.org/drawingml/2006/picture">
+                  <pic:nvPicPr>
+                    <pic:cNvPr id="4" name="block1_q1_fig04_czon_identification.png" descr="Figure 4. Bayesian inverse identification trajectory of C_zon during Stage B." title="block1_q1_fig04_czon_identification.png"/>
+                    <pic:cNvPicPr>
+                      <a:picLocks noChangeAspect="1" noChangeArrowheads="1"/>
+                    </pic:cNvPicPr>
+                  </pic:nvPicPr>
+                  <pic:blipFill>
+                    <a:blip r:embed="rId9"/>
+                    <a:srcRect/>
+                    <a:stretch>
+                      <a:fillRect/>
+                    </a:stretch>
+                  </pic:blipFill>
+                  <pic:spPr>
+                    <a:xfrm>
+                      <a:off x="0" y="0"/>
+                      <a:ext cx="5143500" cy="2476500"/>
+                    </a:xfrm>
+                    <a:prstGeom prst="rect">
+                      <a:avLst/>
+                    </a:prstGeom>
+                  </pic:spPr>
+                </pic:pic>
+              </a:graphicData>
+            </a:graphic>
+          </wp:inline>
+        </w:drawing>
+      </w:r>
+    </w:p>
+    <w:p>
+      <w:pPr>
+        <w:spacing w:before="80" w:after="200"/>
+        <w:jc w:val="center"/>
+      </w:pPr>
+      <w:r>
+        <w:rPr>
+          <w:rFonts w:ascii="Arial" w:hAnsi="Arial" w:eastAsia="Arial" w:cs="Arial"/>
+          <w:i/>
+          <w:iCs/>
+          <w:color w:val="555555"/>
+          <w:sz w:val="19"/>
+          <w:szCs w:val="19"/>
+        </w:rPr>
+        <w:t>Figure 4. Bayesian inverse identification trajectory of C_zon during Stage B.</w:t>
+      </w:r>
+    </w:p>
+    <w:p>
+      <w:pPr>
+        <w:spacing w:before="220" w:after="80"/>
+        <w:jc w:val="center"/>
+      </w:pPr>
+      <w:r>
+        <w:drawing>
+          <wp:inline distT="0" distB="0" distL="0" distR="0">
+            <wp:extent cx="5143500" cy="2476500"/>
+            <wp:effectExtent l="0" t="0" r="0" b="0"/>
+            <wp:docPr id="5" name="block1_q1_fig05_matched_corpus_rmse.png" descr="Figure 5. Corpus-controlled decomposition of 24h rollout RMSE." title="block1_q1_fig05_matched_corpus_rmse.png"/>
+            <wp:cNvGraphicFramePr>
+              <a:graphicFrameLocks xmlns:a="http://schemas.openxmlformats.org/drawingml/2006/main" noChangeAspect="1"/>
+            </wp:cNvGraphicFramePr>
+            <a:graphic xmlns:a="http://schemas.openxmlformats.org/drawingml/2006/main">
+              <a:graphicData uri="http://schemas.openxmlformats.org/drawingml/2006/picture">
+                <pic:pic xmlns:pic="http://schemas.openxmlformats.org/drawingml/2006/picture">
+                  <pic:nvPicPr>
+                    <pic:cNvPr id="5" name="block1_q1_fig05_matched_corpus_rmse.png" descr="Figure 5. Corpus-controlled decomposition of 24h rollout RMSE." title="block1_q1_fig05_matched_corpus_rmse.png"/>
+                    <pic:cNvPicPr>
+                      <a:picLocks noChangeAspect="1" noChangeArrowheads="1"/>
+                    </pic:cNvPicPr>
+                  </pic:nvPicPr>
+                  <pic:blipFill>
+                    <a:blip r:embed="rId10"/>
+                    <a:srcRect/>
+                    <a:stretch>
+                      <a:fillRect/>
+                    </a:stretch>
+                  </pic:blipFill>
+                  <pic:spPr>
+                    <a:xfrm>
+                      <a:off x="0" y="0"/>
+                      <a:ext cx="5143500" cy="2476500"/>
+                    </a:xfrm>
+                    <a:prstGeom prst="rect">
+                      <a:avLst/>
+                    </a:prstGeom>
+                  </pic:spPr>
+                </pic:pic>
+              </a:graphicData>
+            </a:graphic>
+          </wp:inline>
+        </w:drawing>
+      </w:r>
+    </w:p>
+    <w:p>
+      <w:pPr>
+        <w:spacing w:before="80" w:after="200"/>
+        <w:jc w:val="center"/>
+      </w:pPr>
+      <w:r>
+        <w:rPr>
+          <w:rFonts w:ascii="Arial" w:hAnsi="Arial" w:eastAsia="Arial" w:cs="Arial"/>
+          <w:i/>
+          <w:iCs/>
+          <w:color w:val="555555"/>
+          <w:sz w:val="19"/>
+          <w:szCs w:val="19"/>
+        </w:rPr>
+        <w:t>Figure 5. Corpus-controlled decomposition of 24h rollout RMSE.</w:t>
+      </w:r>
+    </w:p>
+    <w:p>
+      <w:pPr>
+        <w:spacing w:before="220" w:after="80"/>
+        <w:jc w:val="center"/>
+      </w:pPr>
+      <w:r>
+        <w:drawing>
+          <wp:inline distT="0" distB="0" distL="0" distR="0">
+            <wp:extent cx="5143500" cy="2571750"/>
+            <wp:effectExtent l="0" t="0" r="0" b="0"/>
+            <wp:docPr id="6" name="block1_q1_fig06_fidelity_gain_waterfall.png" descr="Figure 6. Attribution of the v3-to-v3.5 predictive-fidelity gain." title="block1_q1_fig06_fidelity_gain_waterfall.png"/>
+            <wp:cNvGraphicFramePr>
+              <a:graphicFrameLocks xmlns:a="http://schemas.openxmlformats.org/drawingml/2006/main" noChangeAspect="1"/>
+            </wp:cNvGraphicFramePr>
+            <a:graphic xmlns:a="http://schemas.openxmlformats.org/drawingml/2006/main">
+              <a:graphicData uri="http://schemas.openxmlformats.org/drawingml/2006/picture">
+                <pic:pic xmlns:pic="http://schemas.openxmlformats.org/drawingml/2006/picture">
+                  <pic:nvPicPr>
+                    <pic:cNvPr id="6" name="block1_q1_fig06_fidelity_gain_waterfall.png" descr="Figure 6. Attribution of the v3-to-v3.5 predictive-fidelity gain." title="block1_q1_fig06_fidelity_gain_waterfall.png"/>
+                    <pic:cNvPicPr>
+                      <a:picLocks noChangeAspect="1" noChangeArrowheads="1"/>
+                    </pic:cNvPicPr>
+                  </pic:nvPicPr>
+                  <pic:blipFill>
+                    <a:blip r:embed="rId11"/>
+                    <a:srcRect/>
+                    <a:stretch>
+                      <a:fillRect/>
+                    </a:stretch>
+                  </pic:blipFill>
+                  <pic:spPr>
+                    <a:xfrm>
+                      <a:off x="0" y="0"/>
+                      <a:ext cx="5143500" cy="2571750"/>
+                    </a:xfrm>
+                    <a:prstGeom prst="rect">
+                      <a:avLst/>
+                    </a:prstGeom>
+                  </pic:spPr>
+                </pic:pic>
+              </a:graphicData>
+            </a:graphic>
+          </wp:inline>
+        </w:drawing>
+      </w:r>
+    </w:p>
+    <w:p>
+      <w:pPr>
+        <w:spacing w:before="80" w:after="200"/>
+        <w:jc w:val="center"/>
+      </w:pPr>
+      <w:r>
+        <w:rPr>
+          <w:rFonts w:ascii="Arial" w:hAnsi="Arial" w:eastAsia="Arial" w:cs="Arial"/>
+          <w:i/>
+          <w:iCs/>
+          <w:color w:val="555555"/>
+          <w:sz w:val="19"/>
+          <w:szCs w:val="19"/>
+        </w:rPr>
+        <w:t>Figure 6. Attribution of the v3-to-v3.5 predictive-fidelity gain.</w:t>
+      </w:r>
+    </w:p>
+    <w:p>
+      <w:pPr>
+        <w:spacing w:before="220" w:after="80"/>
+        <w:jc w:val="center"/>
+      </w:pPr>
+      <w:r>
+        <w:drawing>
+          <wp:inline distT="0" distB="0" distL="0" distR="0">
+            <wp:extent cx="4762500" cy="2952750"/>
+            <wp:effectExtent l="0" t="0" r="0" b="0"/>
+            <wp:docPr id="7" name="block1_q1_fig07_fidelity_vs_rl_utility.png" descr="Figure 7. Predictive fidelity does not imply RL training utility." title="block1_q1_fig07_fidelity_vs_rl_utility.png"/>
+            <wp:cNvGraphicFramePr>
+              <a:graphicFrameLocks xmlns:a="http://schemas.openxmlformats.org/drawingml/2006/main" noChangeAspect="1"/>
+            </wp:cNvGraphicFramePr>
+            <a:graphic xmlns:a="http://schemas.openxmlformats.org/drawingml/2006/main">
+              <a:graphicData uri="http://schemas.openxmlformats.org/drawingml/2006/picture">
+                <pic:pic xmlns:pic="http://schemas.openxmlformats.org/drawingml/2006/picture">
+                  <pic:nvPicPr>
+                    <pic:cNvPr id="7" name="block1_q1_fig07_fidelity_vs_rl_utility.png" descr="Figure 7. Predictive fidelity does not imply RL training utility." title="block1_q1_fig07_fidelity_vs_rl_utility.png"/>
+                    <pic:cNvPicPr>
+                      <a:picLocks noChangeAspect="1" noChangeArrowheads="1"/>
+                    </pic:cNvPicPr>
+                  </pic:nvPicPr>
+                  <pic:blipFill>
+                    <a:blip r:embed="rId12"/>
+                    <a:srcRect/>
+                    <a:stretch>
+                      <a:fillRect/>
+                    </a:stretch>
+                  </pic:blipFill>
+                  <pic:spPr>
+                    <a:xfrm>
+                      <a:off x="0" y="0"/>
+                      <a:ext cx="4762500" cy="2952750"/>
+                    </a:xfrm>
+                    <a:prstGeom prst="rect">
+                      <a:avLst/>
+                    </a:prstGeom>
+                  </pic:spPr>
+                </pic:pic>
+              </a:graphicData>
+            </a:graphic>
+          </wp:inline>
+        </w:drawing>
+      </w:r>
+    </w:p>
+    <w:p>
+      <w:pPr>
+        <w:spacing w:before="80" w:after="200"/>
+        <w:jc w:val="center"/>
+      </w:pPr>
+      <w:r>
+        <w:rPr>
+          <w:rFonts w:ascii="Arial" w:hAnsi="Arial" w:eastAsia="Arial" w:cs="Arial"/>
+          <w:i/>
+          <w:iCs/>
+          <w:color w:val="555555"/>
+          <w:sz w:val="19"/>
+          <w:szCs w:val="19"/>
+        </w:rPr>
+        <w:t>Figure 7. Predictive fidelity does not imply RL training utility.</w:t>
+      </w:r>
+    </w:p>
+    <w:p>
+      <w:pPr>
+        <w:spacing w:before="220" w:after="80"/>
+        <w:jc w:val="center"/>
+      </w:pPr>
+      <w:r>
+        <w:drawing>
+          <wp:inline distT="0" distB="0" distL="0" distR="0">
+            <wp:extent cx="5334000" cy="2714625"/>
+            <wp:effectExtent l="0" t="0" r="0" b="0"/>
+            <wp:docPr id="8" name="block1_q1_fig08_live_boptest_performance.png" descr="Figure 8. Live closed-loop BOPTEST performance of PPO controllers trained on different backends." title="block1_q1_fig08_live_boptest_performance.png"/>
+            <wp:cNvGraphicFramePr>
+              <a:graphicFrameLocks xmlns:a="http://schemas.openxmlformats.org/drawingml/2006/main" noChangeAspect="1"/>
+            </wp:cNvGraphicFramePr>
+            <a:graphic xmlns:a="http://schemas.openxmlformats.org/drawingml/2006/main">
+              <a:graphicData uri="http://schemas.openxmlformats.org/drawingml/2006/picture">
+                <pic:pic xmlns:pic="http://schemas.openxmlformats.org/drawingml/2006/picture">
+                  <pic:nvPicPr>
+                    <pic:cNvPr id="8" name="block1_q1_fig08_live_boptest_performance.png" descr="Figure 8. Live closed-loop BOPTEST performance of PPO controllers trained on different backends." title="block1_q1_fig08_live_boptest_performance.png"/>
+                    <pic:cNvPicPr>
+                      <a:picLocks noChangeAspect="1" noChangeArrowheads="1"/>
+                    </pic:cNvPicPr>
+                  </pic:nvPicPr>
+                  <pic:blipFill>
+                    <a:blip r:embed="rId13"/>
+                    <a:srcRect/>
+                    <a:stretch>
+                      <a:fillRect/>
+                    </a:stretch>
+                  </pic:blipFill>
+                  <pic:spPr>
+                    <a:xfrm>
+                      <a:off x="0" y="0"/>
+                      <a:ext cx="5334000" cy="2714625"/>
+                    </a:xfrm>
+                    <a:prstGeom prst="rect">
+                      <a:avLst/>
+                    </a:prstGeom>
+                  </pic:spPr>
+                </pic:pic>
+              </a:graphicData>
+            </a:graphic>
+          </wp:inline>
+        </w:drawing>
+      </w:r>
+    </w:p>
+    <w:p>
+      <w:pPr>
+        <w:spacing w:before="80" w:after="200"/>
+        <w:jc w:val="center"/>
+      </w:pPr>
+      <w:r>
+        <w:rPr>
+          <w:rFonts w:ascii="Arial" w:hAnsi="Arial" w:eastAsia="Arial" w:cs="Arial"/>
+          <w:i/>
+          <w:iCs/>
+          <w:color w:val="555555"/>
+          <w:sz w:val="19"/>
+          <w:szCs w:val="19"/>
+        </w:rPr>
+        <w:t>Figure 8. Live closed-loop BOPTEST performance of PPO controllers trained on different backends.</w:t>
+      </w:r>
+    </w:p>
+    <w:p>
+      <w:pPr>
+        <w:spacing w:before="220" w:after="80"/>
+        <w:jc w:val="center"/>
+      </w:pPr>
+      <w:r>
+        <w:drawing>
+          <wp:inline distT="0" distB="0" distL="0" distR="0">
+            <wp:extent cx="4953000" cy="2619375"/>
+            <wp:effectExtent l="0" t="0" r="0" b="0"/>
+            <wp:docPr id="9" name="block1_q1_fig09_backend_speed.png" descr="Figure 9. Simulation throughput of BOPTEST and surrogate backends." title="block1_q1_fig09_backend_speed.png"/>
+            <wp:cNvGraphicFramePr>
+              <a:graphicFrameLocks xmlns:a="http://schemas.openxmlformats.org/drawingml/2006/main" noChangeAspect="1"/>
+            </wp:cNvGraphicFramePr>
+            <a:graphic xmlns:a="http://schemas.openxmlformats.org/drawingml/2006/main">
+              <a:graphicData uri="http://schemas.openxmlformats.org/drawingml/2006/picture">
+                <pic:pic xmlns:pic="http://schemas.openxmlformats.org/drawingml/2006/picture">
+                  <pic:nvPicPr>
+                    <pic:cNvPr id="9" name="block1_q1_fig09_backend_speed.png" descr="Figure 9. Simulation throughput of BOPTEST and surrogate backends." title="block1_q1_fig09_backend_speed.png"/>
+                    <pic:cNvPicPr>
+                      <a:picLocks noChangeAspect="1" noChangeArrowheads="1"/>
+                    </pic:cNvPicPr>
+                  </pic:nvPicPr>
+                  <pic:blipFill>
+                    <a:blip r:embed="rId14"/>
+                    <a:srcRect/>
+                    <a:stretch>
+                      <a:fillRect/>
+                    </a:stretch>
+                  </pic:blipFill>
+                  <pic:spPr>
+                    <a:xfrm>
+                      <a:off x="0" y="0"/>
+                      <a:ext cx="4953000" cy="2619375"/>
+                    </a:xfrm>
+                    <a:prstGeom prst="rect">
+                      <a:avLst/>
+                    </a:prstGeom>
+                  </pic:spPr>
+                </pic:pic>
+              </a:graphicData>
+            </a:graphic>
+          </wp:inline>
+        </w:drawing>
+      </w:r>
+    </w:p>
+    <w:p>
+      <w:pPr>
+        <w:spacing w:before="80" w:after="200"/>
+        <w:jc w:val="center"/>
+      </w:pPr>
+      <w:r>
+        <w:rPr>
+          <w:rFonts w:ascii="Arial" w:hAnsi="Arial" w:eastAsia="Arial" w:cs="Arial"/>
+          <w:i/>
+          <w:iCs/>
+          <w:color w:val="555555"/>
+          <w:sz w:val="19"/>
+          <w:szCs w:val="19"/>
+        </w:rPr>
+        <w:t>Figure 9. Simulation throughput of BOPTEST and surrogate backends.</w:t>
+      </w:r>
+    </w:p>
+    <w:p>
+      <w:pPr>
+        <w:spacing w:before="220" w:after="80"/>
+        <w:jc w:val="center"/>
+      </w:pPr>
+      <w:r>
+        <w:drawing>
+          <wp:inline distT="0" distB="0" distL="0" distR="0">
+            <wp:extent cx="5334000" cy="2476500"/>
+            <wp:effectExtent l="0" t="0" r="0" b="0"/>
+            <wp:docPr id="10" name="block1_q1_fig10_transfer_gap_diagnostics.png" descr="Figure 10. Transfer-gap diagnostics reveal bang-bang saturation in standalone v3.5 training." title="block1_q1_fig10_transfer_gap_diagnostics.png"/>
+            <wp:cNvGraphicFramePr>
+              <a:graphicFrameLocks xmlns:a="http://schemas.openxmlformats.org/drawingml/2006/main" noChangeAspect="1"/>
+            </wp:cNvGraphicFramePr>
+            <a:graphic xmlns:a="http://schemas.openxmlformats.org/drawingml/2006/main">
+              <a:graphicData uri="http://schemas.openxmlformats.org/drawingml/2006/picture">
+                <pic:pic xmlns:pic="http://schemas.openxmlformats.org/drawingml/2006/picture">
+                  <pic:nvPicPr>
+                    <pic:cNvPr id="10" name="block1_q1_fig10_transfer_gap_diagnostics.png" descr="Figure 10. Transfer-gap diagnostics reveal bang-bang saturation in standalone v3.5 training." title="block1_q1_fig10_transfer_gap_diagnostics.png"/>
+                    <pic:cNvPicPr>
+                      <a:picLocks noChangeAspect="1" noChangeArrowheads="1"/>
+                    </pic:cNvPicPr>
+                  </pic:nvPicPr>
+                  <pic:blipFill>
+                    <a:blip r:embed="rId15"/>
+                    <a:srcRect/>
+                    <a:stretch>
+                      <a:fillRect/>
+                    </a:stretch>
+                  </pic:blipFill>
+                  <pic:spPr>
+                    <a:xfrm>
+                      <a:off x="0" y="0"/>
+                      <a:ext cx="5334000" cy="2476500"/>
+                    </a:xfrm>
+                    <a:prstGeom prst="rect">
+                      <a:avLst/>
+                    </a:prstGeom>
+                  </pic:spPr>
+                </pic:pic>
+              </a:graphicData>
+            </a:graphic>
+          </wp:inline>
+        </w:drawing>
+      </w:r>
+    </w:p>
+    <w:p>
+      <w:pPr>
+        <w:spacing w:before="80" w:after="200"/>
+        <w:jc w:val="center"/>
+      </w:pPr>
+      <w:r>
+        <w:rPr>
+          <w:rFonts w:ascii="Arial" w:hAnsi="Arial" w:eastAsia="Arial" w:cs="Arial"/>
+          <w:i/>
+          <w:iCs/>
+          <w:color w:val="555555"/>
+          <w:sz w:val="19"/>
+          <w:szCs w:val="19"/>
+        </w:rPr>
+        <w:t>Figure 10. Transfer-gap diagnostics reveal bang-bang saturation in standalone v3.5 training.</w:t>
+      </w:r>
+    </w:p>
+    <w:p>
+      <w:pPr>
+        <w:spacing w:before="220" w:after="80"/>
+        <w:jc w:val="center"/>
+      </w:pPr>
+      <w:r>
+        <w:drawing>
+          <wp:inline distT="0" distB="0" distL="0" distR="0">
+            <wp:extent cx="5143500" cy="2476500"/>
+            <wp:effectExtent l="0" t="0" r="0" b="0"/>
+            <wp:docPr id="11" name="block1_q1_fig11_action_saturation.png" descr="Figure 11. Policy action saturation under direct v3.5 training." title="block1_q1_fig11_action_saturation.png"/>
+            <wp:cNvGraphicFramePr>
+              <a:graphicFrameLocks xmlns:a="http://schemas.openxmlformats.org/drawingml/2006/main" noChangeAspect="1"/>
+            </wp:cNvGraphicFramePr>
+            <a:graphic xmlns:a="http://schemas.openxmlformats.org/drawingml/2006/main">
+              <a:graphicData uri="http://schemas.openxmlformats.org/drawingml/2006/picture">
+                <pic:pic xmlns:pic="http://schemas.openxmlformats.org/drawingml/2006/picture">
+                  <pic:nvPicPr>
+                    <pic:cNvPr id="11" name="block1_q1_fig11_action_saturation.png" descr="Figure 11. Policy action saturation under direct v3.5 training." title="block1_q1_fig11_action_saturation.png"/>
+                    <pic:cNvPicPr>
+                      <a:picLocks noChangeAspect="1" noChangeArrowheads="1"/>
+                    </pic:cNvPicPr>
+                  </pic:nvPicPr>
+                  <pic:blipFill>
+                    <a:blip r:embed="rId16"/>
+                    <a:srcRect/>
+                    <a:stretch>
+                      <a:fillRect/>
+                    </a:stretch>
+                  </pic:blipFill>
+                  <pic:spPr>
+                    <a:xfrm>
+                      <a:off x="0" y="0"/>
+                      <a:ext cx="5143500" cy="2476500"/>
+                    </a:xfrm>
+                    <a:prstGeom prst="rect">
+                      <a:avLst/>
+                    </a:prstGeom>
+                  </pic:spPr>
+                </pic:pic>
+              </a:graphicData>
+            </a:graphic>
+          </wp:inline>
+        </w:drawing>
+      </w:r>
+    </w:p>
+    <w:p>
+      <w:pPr>
+        <w:spacing w:before="80" w:after="200"/>
+        <w:jc w:val="center"/>
+      </w:pPr>
+      <w:r>
+        <w:rPr>
+          <w:rFonts w:ascii="Arial" w:hAnsi="Arial" w:eastAsia="Arial" w:cs="Arial"/>
+          <w:i/>
+          <w:iCs/>
+          <w:color w:val="555555"/>
+          <w:sz w:val="19"/>
+          <w:szCs w:val="19"/>
+        </w:rPr>
+        <w:t>Figure 11. Policy action saturation under direct v3.5 training.</w:t>
+      </w:r>
+    </w:p>
+    <w:p>
+      <w:pPr>
+        <w:spacing w:before="220" w:after="80"/>
+        <w:jc w:val="center"/>
+      </w:pPr>
+      <w:r>
+        <w:drawing>
+          <wp:inline distT="0" distB="0" distL="0" distR="0">
+            <wp:extent cx="5334000" cy="2714625"/>
+            <wp:effectExtent l="0" t="0" r="0" b="0"/>
+            <wp:docPr id="12" name="block1_q1_fig12_per_episode_rmse.png" descr="Figure 12. Replicative validity across held-out BOPTEST episodes." title="block1_q1_fig12_per_episode_rmse.png"/>
+            <wp:cNvGraphicFramePr>
+              <a:graphicFrameLocks xmlns:a="http://schemas.openxmlformats.org/drawingml/2006/main" noChangeAspect="1"/>
+            </wp:cNvGraphicFramePr>
+            <a:graphic xmlns:a="http://schemas.openxmlformats.org/drawingml/2006/main">
+              <a:graphicData uri="http://schemas.openxmlformats.org/drawingml/2006/picture">
+                <pic:pic xmlns:pic="http://schemas.openxmlformats.org/drawingml/2006/picture">
+                  <pic:nvPicPr>
+                    <pic:cNvPr id="12" name="block1_q1_fig12_per_episode_rmse.png" descr="Figure 12. Replicative validity across held-out BOPTEST episodes." title="block1_q1_fig12_per_episode_rmse.png"/>
+                    <pic:cNvPicPr>
+                      <a:picLocks noChangeAspect="1" noChangeArrowheads="1"/>
+                    </pic:cNvPicPr>
+                  </pic:nvPicPr>
+                  <pic:blipFill>
+                    <a:blip r:embed="rId17"/>
+                    <a:srcRect/>
+                    <a:stretch>
+                      <a:fillRect/>
+                    </a:stretch>
+                  </pic:blipFill>
+                  <pic:spPr>
+                    <a:xfrm>
+                      <a:off x="0" y="0"/>
+                      <a:ext cx="5334000" cy="2714625"/>
+                    </a:xfrm>
+                    <a:prstGeom prst="rect">
+                      <a:avLst/>
+                    </a:prstGeom>
+                  </pic:spPr>
+                </pic:pic>
+              </a:graphicData>
+            </a:graphic>
+          </wp:inline>
+        </w:drawing>
+      </w:r>
+    </w:p>
+    <w:p>
+      <w:pPr>
+        <w:spacing w:before="80" w:after="200"/>
+        <w:jc w:val="center"/>
+      </w:pPr>
+      <w:r>
+        <w:rPr>
+          <w:rFonts w:ascii="Arial" w:hAnsi="Arial" w:eastAsia="Arial" w:cs="Arial"/>
+          <w:i/>
+          <w:iCs/>
+          <w:color w:val="555555"/>
+          <w:sz w:val="19"/>
+          <w:szCs w:val="19"/>
+        </w:rPr>
+        <w:t>Figure 12. Replicative validity across held-out BOPTEST episodes.</w:t>
+      </w:r>
+    </w:p>
+    <w:p>
+      <w:pPr>
+        <w:spacing w:before="220" w:after="80"/>
+        <w:jc w:val="center"/>
+      </w:pPr>
+      <w:r>
+        <w:drawing>
+          <wp:inline distT="0" distB="0" distL="0" distR="0">
+            <wp:extent cx="5334000" cy="2476500"/>
+            <wp:effectExtent l="0" t="0" r="0" b="0"/>
+            <wp:docPr id="13" name="block1_q1_fig13_residual_distributions.png" descr="Figure 13. Temperature residual distributions before and after calibration." title="block1_q1_fig13_residual_distributions.png"/>
+            <wp:cNvGraphicFramePr>
+              <a:graphicFrameLocks xmlns:a="http://schemas.openxmlformats.org/drawingml/2006/main" noChangeAspect="1"/>
+            </wp:cNvGraphicFramePr>
+            <a:graphic xmlns:a="http://schemas.openxmlformats.org/drawingml/2006/main">
+              <a:graphicData uri="http://schemas.openxmlformats.org/drawingml/2006/picture">
+                <pic:pic xmlns:pic="http://schemas.openxmlformats.org/drawingml/2006/picture">
+                  <pic:nvPicPr>
+                    <pic:cNvPr id="13" name="block1_q1_fig13_residual_distributions.png" descr="Figure 13. Temperature residual distributions before and after calibration." title="block1_q1_fig13_residual_distributions.png"/>
+                    <pic:cNvPicPr>
+                      <a:picLocks noChangeAspect="1" noChangeArrowheads="1"/>
+                    </pic:cNvPicPr>
+                  </pic:nvPicPr>
+                  <pic:blipFill>
+                    <a:blip r:embed="rId18"/>
+                    <a:srcRect/>
+                    <a:stretch>
+                      <a:fillRect/>
+                    </a:stretch>
+                  </pic:blipFill>
+                  <pic:spPr>
+                    <a:xfrm>
+                      <a:off x="0" y="0"/>
+                      <a:ext cx="5334000" cy="2476500"/>
+                    </a:xfrm>
+                    <a:prstGeom prst="rect">
+                      <a:avLst/>
+                    </a:prstGeom>
+                  </pic:spPr>
+                </pic:pic>
+              </a:graphicData>
+            </a:graphic>
+          </wp:inline>
+        </w:drawing>
+      </w:r>
+    </w:p>
+    <w:p>
+      <w:pPr>
+        <w:spacing w:before="80" w:after="200"/>
+        <w:jc w:val="center"/>
+      </w:pPr>
+      <w:r>
+        <w:rPr>
+          <w:rFonts w:ascii="Arial" w:hAnsi="Arial" w:eastAsia="Arial" w:cs="Arial"/>
+          <w:i/>
+          <w:iCs/>
+          <w:color w:val="555555"/>
+          <w:sz w:val="19"/>
+          <w:szCs w:val="19"/>
+        </w:rPr>
+        <w:t>Figure 13. Temperature residual distributions before and after calibration.</w:t>
+      </w:r>
+    </w:p>
+    <w:p>
+      <w:pPr>
+        <w:spacing w:before="220" w:after="80"/>
+        <w:jc w:val="center"/>
+      </w:pPr>
+      <w:r>
+        <w:drawing>
+          <wp:inline distT="0" distB="0" distL="0" distR="0">
+            <wp:extent cx="5334000" cy="2381250"/>
+            <wp:effectExtent l="0" t="0" r="0" b="0"/>
+            <wp:docPr id="14" name="block1_q1_fig14_hybrid_loss.png" descr="Figure 14. Hybrid backend: v3 rollout dynamics with frozen-v3.5 soft regularization." title="block1_q1_fig14_hybrid_loss.png"/>
+            <wp:cNvGraphicFramePr>
+              <a:graphicFrameLocks xmlns:a="http://schemas.openxmlformats.org/drawingml/2006/main" noChangeAspect="1"/>
+            </wp:cNvGraphicFramePr>
+            <a:graphic xmlns:a="http://schemas.openxmlformats.org/drawingml/2006/main">
+              <a:graphicData uri="http://schemas.openxmlformats.org/drawingml/2006/picture">
+                <pic:pic xmlns:pic="http://schemas.openxmlformats.org/drawingml/2006/picture">
+                  <pic:nvPicPr>
+                    <pic:cNvPr id="14" name="block1_q1_fig14_hybrid_loss.png" descr="Figure 14. Hybrid backend: v3 rollout dynamics with frozen-v3.5 soft regularization." title="block1_q1_fig14_hybrid_loss.png"/>
+                    <pic:cNvPicPr>
+                      <a:picLocks noChangeAspect="1" noChangeArrowheads="1"/>
+                    </pic:cNvPicPr>
+                  </pic:nvPicPr>
+                  <pic:blipFill>
+                    <a:blip r:embed="rId19"/>
+                    <a:srcRect/>
+                    <a:stretch>
+                      <a:fillRect/>
+                    </a:stretch>
+                  </pic:blipFill>
+                  <pic:spPr>
+                    <a:xfrm>
+                      <a:off x="0" y="0"/>
+                      <a:ext cx="5334000" cy="2381250"/>
+                    </a:xfrm>
+                    <a:prstGeom prst="rect">
+                      <a:avLst/>
+                    </a:prstGeom>
+                  </pic:spPr>
+                </pic:pic>
+              </a:graphicData>
+            </a:graphic>
+          </wp:inline>
+        </w:drawing>
+      </w:r>
+    </w:p>
+    <w:p>
+      <w:pPr>
+        <w:spacing w:before="80" w:after="200"/>
+        <w:jc w:val="center"/>
+      </w:pPr>
+      <w:r>
+        <w:rPr>
+          <w:rFonts w:ascii="Arial" w:hAnsi="Arial" w:eastAsia="Arial" w:cs="Arial"/>
+          <w:i/>
+          <w:iCs/>
+          <w:color w:val="555555"/>
+          <w:sz w:val="19"/>
+          <w:szCs w:val="19"/>
+        </w:rPr>
+        <w:t>Figure 14. Hybrid backend: v3 rollout dynamics with frozen-v3.5 soft regularization.</w:t>
+      </w:r>
+    </w:p>
+    <w:p>
+      <w:pPr>
+        <w:spacing w:before="220" w:after="80"/>
+        <w:jc w:val="center"/>
+      </w:pPr>
+      <w:r>
+        <w:drawing>
+          <wp:inline distT="0" distB="0" distL="0" distR="0">
+            <wp:extent cx="4953000" cy="3429000"/>
+            <wp:effectExtent l="0" t="0" r="0" b="0"/>
+            <wp:docPr id="15" name="block1_q1_fig15_literature_positioning.png" descr="Figure 15. Positioning of this study against prior HVAC DRL and surrogate-model literature." title="block1_q1_fig15_literature_positioning.png"/>
+            <wp:cNvGraphicFramePr>
+              <a:graphicFrameLocks xmlns:a="http://schemas.openxmlformats.org/drawingml/2006/main" noChangeAspect="1"/>
+            </wp:cNvGraphicFramePr>
+            <a:graphic xmlns:a="http://schemas.openxmlformats.org/drawingml/2006/main">
+              <a:graphicData uri="http://schemas.openxmlformats.org/drawingml/2006/picture">
+                <pic:pic xmlns:pic="http://schemas.openxmlformats.org/drawingml/2006/picture">
+                  <pic:nvPicPr>
+                    <pic:cNvPr id="15" name="block1_q1_fig15_literature_positioning.png" descr="Figure 15. Positioning of this study against prior HVAC DRL and surrogate-model literature." title="block1_q1_fig15_literature_positioning.png"/>
+                    <pic:cNvPicPr>
+                      <a:picLocks noChangeAspect="1" noChangeArrowheads="1"/>
+                    </pic:cNvPicPr>
+                  </pic:nvPicPr>
+                  <pic:blipFill>
+                    <a:blip r:embed="rId20"/>
+                    <a:srcRect/>
+                    <a:stretch>
+                      <a:fillRect/>
+                    </a:stretch>
+                  </pic:blipFill>
+                  <pic:spPr>
+                    <a:xfrm>
+                      <a:off x="0" y="0"/>
+                      <a:ext cx="4953000" cy="3429000"/>
+                    </a:xfrm>
+                    <a:prstGeom prst="rect">
+                      <a:avLst/>
+                    </a:prstGeom>
+                  </pic:spPr>
+                </pic:pic>
+              </a:graphicData>
+            </a:graphic>
+          </wp:inline>
+        </w:drawing>
+      </w:r>
+    </w:p>
+    <w:p>
+      <w:pPr>
+        <w:spacing w:before="80" w:after="200"/>
+        <w:jc w:val="center"/>
+      </w:pPr>
+      <w:r>
+        <w:rPr>
+          <w:rFonts w:ascii="Arial" w:hAnsi="Arial" w:eastAsia="Arial" w:cs="Arial"/>
+          <w:i/>
+          <w:iCs/>
+          <w:color w:val="555555"/>
+          <w:sz w:val="19"/>
+          <w:szCs w:val="19"/>
+        </w:rPr>
+        <w:t>Figure 15. Positioning of this study against prior HVAC DRL and surrogate-model literature.</w:t>
       </w:r>
     </w:p>
     <w:p>
@@ -2565,25 +3577,11 @@
         <w:t>Training was launched for up to 500 epochs but stopped early at epoch 215 because validation loss plateaued for 30 epochs; the best validation checkpoint comes from epoch 184. At that checkpoint the supervised one-step temperature RMSE is 0.6255 °C and R² is 0.9794 on the held-out 20 % split. This R² is high because the held-out split is contiguous (the final 20 % of the corpus by index, which happens to be autumn-only) — S3 split-representativeness flags this as "limited" and the project explicitly relies on external BOPTEST benchmark windows rather than this split for any downstream control claim.</w:t>
       </w:r>
     </w:p>
-    <w:p>
-      <w:pPr>
-        <w:spacing w:before="200" w:after="60"/>
-      </w:pPr>
-      <w:r>
-        <w:rPr>
-          <w:rFonts w:ascii="Arial" w:hAnsi="Arial" w:eastAsia="Arial" w:cs="Arial"/>
-          <w:b/>
-          <w:bCs/>
-          <w:color w:val="1F4E79"/>
-          <w:sz w:val="20"/>
-          <w:szCs w:val="20"/>
-        </w:rPr>
-        <w:t>Table 1.2 — v3 training result (from rc_node_v3_tsupply.pt checkpoint)</w:t>
-      </w:r>
-    </w:p>
     <w:tbl>
       <w:tblPr>
         <w:tblStyle w:val="9"/>
+        <w:tblpPr w:leftFromText="180" w:rightFromText="180" w:vertAnchor="text" w:horzAnchor="page" w:tblpX="1207" w:tblpY="286"/>
+        <w:tblOverlap w:val="never"/>
         <w:tblW w:w="9360" w:type="dxa"/>
         <w:tblInd w:w="0" w:type="dxa"/>
         <w:tblBorders>
@@ -3064,6 +4062,22 @@
         </w:tc>
       </w:tr>
     </w:tbl>
+    <w:p>
+      <w:pPr>
+        <w:spacing w:before="200" w:after="60"/>
+      </w:pPr>
+      <w:r>
+        <w:rPr>
+          <w:rFonts w:ascii="Arial" w:hAnsi="Arial" w:eastAsia="Arial" w:cs="Arial"/>
+          <w:b/>
+          <w:bCs/>
+          <w:color w:val="1F4E79"/>
+          <w:sz w:val="20"/>
+          <w:szCs w:val="20"/>
+        </w:rPr>
+        <w:t>Table 1.2 — v3 training result (from rc_node_v3_tsupply.pt checkpoint)</w:t>
+      </w:r>
+    </w:p>
     <w:p>
       <w:pPr>
         <w:spacing w:before="80" w:after="200"/>
@@ -3170,12 +4184,6 @@
             <w:insideH w:val="single" w:color="auto" w:sz="4" w:space="0"/>
             <w:insideV w:val="single" w:color="auto" w:sz="4" w:space="0"/>
           </w:tblBorders>
-          <w:tblCellMar>
-            <w:top w:w="0" w:type="dxa"/>
-            <w:left w:w="10" w:type="dxa"/>
-            <w:bottom w:w="0" w:type="dxa"/>
-            <w:right w:w="10" w:type="dxa"/>
-          </w:tblCellMar>
         </w:tblPrEx>
         <w:tc>
           <w:tcPr>
@@ -10120,6 +11128,8 @@
     <w:tbl>
       <w:tblPr>
         <w:tblStyle w:val="9"/>
+        <w:tblpPr w:leftFromText="180" w:rightFromText="180" w:vertAnchor="text" w:horzAnchor="page" w:tblpX="1195" w:tblpY="292"/>
+        <w:tblOverlap w:val="never"/>
         <w:tblW w:w="9360" w:type="dxa"/>
         <w:tblInd w:w="0" w:type="dxa"/>
         <w:tblBorders>
@@ -10155,12 +11165,6 @@
             <w:insideH w:val="single" w:color="auto" w:sz="4" w:space="0"/>
             <w:insideV w:val="single" w:color="auto" w:sz="4" w:space="0"/>
           </w:tblBorders>
-          <w:tblCellMar>
-            <w:top w:w="0" w:type="dxa"/>
-            <w:left w:w="10" w:type="dxa"/>
-            <w:bottom w:w="0" w:type="dxa"/>
-            <w:right w:w="10" w:type="dxa"/>
-          </w:tblCellMar>
         </w:tblPrEx>
         <w:tc>
           <w:tcPr>
@@ -11063,6 +12067,7 @@
         <w:spacing w:after="160"/>
         <w:jc w:val="both"/>
       </w:pPr>
+      <w:bookmarkStart w:id="0" w:name="_GoBack"/>
       <w:r>
         <w:rPr>
           <w:rFonts w:ascii="Arial" w:hAnsi="Arial" w:eastAsia="Arial" w:cs="Arial"/>
@@ -11093,6 +12098,7 @@
         </w:rPr>
         <w:t>Two practical points follow. First, although v3 is the fastest backend, we do not train PPO purely on v3 because that gives up the regularisation benefit measured in Section 4. Second, although v3.5 is faster than the hybrid (2400 steps/s) we do not train PPO on v3.5 either — Section 4 shows that PPO trained on standalone calibrated v3.5 fails catastrophically on the live BOPTEST loop (RMSE &gt; 4 °C). The hybrid backend is therefore the unique operating point where speed, fidelity, and trainability all reach acceptable levels simultaneously.</w:t>
       </w:r>
+      <w:bookmarkEnd w:id="0"/>
     </w:p>
     <w:p>
       <w:pPr>
@@ -14196,7 +15202,7 @@
         <w:rPr>
           <w:rFonts w:ascii="Arial" w:hAnsi="Arial" w:eastAsia="Arial" w:cs="Arial"/>
         </w:rPr>
-        <w:t>7. Figures from Project Artifacts</w:t>
+        <w:t>7. Figure Provenance and Q1 Presentation Logic</w:t>
       </w:r>
     </w:p>
     <w:p>
@@ -14214,58 +15220,1897 @@
           <w:sz w:val="22"/>
           <w:szCs w:val="22"/>
         </w:rPr>
-        <w:t>The figures below visualise the same numerical findings discussed in Sections 1 – 6 directly from project artifacts (paper/figures/q1/, reports/figures/article_real/). They are reproduced here so the document is self-contained.</w:t>
+        <w:t>The Block 1 figures are presented once, in strict numerical order, near the beginning of the dossier. This section records the exact source files so the figure-led narrative remains auditable and reviewer-facing. The removed gallery entries that described Block 3 C_zon transferability are intentionally not repeated here because they belong to the transferability results section, not Block 1.</w:t>
       </w:r>
     </w:p>
     <w:p>
       <w:pPr>
-        <w:spacing w:before="200"/>
-        <w:jc w:val="center"/>
+        <w:spacing w:before="200" w:after="60"/>
       </w:pPr>
       <w:r>
-        <w:drawing>
-          <wp:inline distT="0" distB="0" distL="0" distR="0">
-            <wp:extent cx="5334000" cy="2381250"/>
-            <wp:effectExtent l="0" t="0" r="0" b="0"/>
-            <wp:docPr id="1" name="C1_pipeline_overview.png" descr="Figure 7.1 — Full pipeline overview. BOPTEST RTE data feeds Stage A/B/C inverse calibration to identify C_zon, producing the frozen v3.5 physical twin. The hybrid backend couples v3 (smooth RL dynamics) and v3.5 (frozen regulariser) via the hybrid loss." title="C1_pipeline_overview.png"/>
-            <wp:cNvGraphicFramePr>
-              <a:graphicFrameLocks xmlns:a="http://schemas.openxmlformats.org/drawingml/2006/main" noChangeAspect="1"/>
-            </wp:cNvGraphicFramePr>
-            <a:graphic xmlns:a="http://schemas.openxmlformats.org/drawingml/2006/main">
-              <a:graphicData uri="http://schemas.openxmlformats.org/drawingml/2006/picture">
-                <pic:pic xmlns:pic="http://schemas.openxmlformats.org/drawingml/2006/picture">
-                  <pic:nvPicPr>
-                    <pic:cNvPr id="1" name="C1_pipeline_overview.png" descr="Figure 7.1 — Full pipeline overview. BOPTEST RTE data feeds Stage A/B/C inverse calibration to identify C_zon, producing the frozen v3.5 physical twin. The hybrid backend couples v3 (smooth RL dynamics) and v3.5 (frozen regulariser) via the hybrid loss." title="C1_pipeline_overview.png"/>
-                    <pic:cNvPicPr>
-                      <a:picLocks noChangeAspect="1" noChangeArrowheads="1"/>
-                    </pic:cNvPicPr>
-                  </pic:nvPicPr>
-                  <pic:blipFill>
-                    <a:blip r:embed="rId6"/>
-                    <a:srcRect/>
-                    <a:stretch>
-                      <a:fillRect/>
-                    </a:stretch>
-                  </pic:blipFill>
-                  <pic:spPr>
-                    <a:xfrm>
-                      <a:off x="0" y="0"/>
-                      <a:ext cx="5334000" cy="2381250"/>
-                    </a:xfrm>
-                    <a:prstGeom prst="rect">
-                      <a:avLst/>
-                    </a:prstGeom>
-                  </pic:spPr>
-                </pic:pic>
-              </a:graphicData>
-            </a:graphic>
-          </wp:inline>
-        </w:drawing>
+        <w:rPr>
+          <w:rFonts w:ascii="Arial" w:hAnsi="Arial" w:eastAsia="Arial" w:cs="Arial"/>
+          <w:b/>
+          <w:bCs/>
+          <w:color w:val="1F4E79"/>
+          <w:sz w:val="20"/>
+          <w:szCs w:val="20"/>
+        </w:rPr>
+        <w:t>Table 7.1 — Embedded Block 1 figure provenance</w:t>
       </w:r>
     </w:p>
+    <w:tbl>
+      <w:tblPr>
+        <w:tblStyle w:val="9"/>
+        <w:tblW w:w="9360" w:type="dxa"/>
+        <w:tblInd w:w="0" w:type="dxa"/>
+        <w:tblBorders>
+          <w:top w:val="single" w:color="auto" w:sz="4" w:space="0"/>
+          <w:left w:val="single" w:color="auto" w:sz="4" w:space="0"/>
+          <w:bottom w:val="single" w:color="auto" w:sz="4" w:space="0"/>
+          <w:right w:val="single" w:color="auto" w:sz="4" w:space="0"/>
+          <w:insideH w:val="single" w:color="auto" w:sz="4" w:space="0"/>
+          <w:insideV w:val="single" w:color="auto" w:sz="4" w:space="0"/>
+        </w:tblBorders>
+        <w:tblLayout w:type="autofit"/>
+        <w:tblCellMar>
+          <w:top w:w="0" w:type="dxa"/>
+          <w:left w:w="10" w:type="dxa"/>
+          <w:bottom w:w="0" w:type="dxa"/>
+          <w:right w:w="10" w:type="dxa"/>
+        </w:tblCellMar>
+      </w:tblPr>
+      <w:tblGrid>
+        <w:gridCol w:w="873"/>
+        <w:gridCol w:w="4033"/>
+        <w:gridCol w:w="4454"/>
+      </w:tblGrid>
+      <w:tr>
+        <w:tblPrEx>
+          <w:tblBorders>
+            <w:top w:val="single" w:color="auto" w:sz="4" w:space="0"/>
+            <w:left w:val="single" w:color="auto" w:sz="4" w:space="0"/>
+            <w:bottom w:val="single" w:color="auto" w:sz="4" w:space="0"/>
+            <w:right w:val="single" w:color="auto" w:sz="4" w:space="0"/>
+            <w:insideH w:val="single" w:color="auto" w:sz="4" w:space="0"/>
+            <w:insideV w:val="single" w:color="auto" w:sz="4" w:space="0"/>
+          </w:tblBorders>
+          <w:tblCellMar>
+            <w:top w:w="0" w:type="dxa"/>
+            <w:left w:w="10" w:type="dxa"/>
+            <w:bottom w:w="0" w:type="dxa"/>
+            <w:right w:w="10" w:type="dxa"/>
+          </w:tblCellMar>
+        </w:tblPrEx>
+        <w:tc>
+          <w:tcPr>
+            <w:tcW w:w="900" w:type="dxa"/>
+            <w:tcBorders>
+              <w:top w:val="single" w:color="CCCCCC" w:sz="0" w:space="0"/>
+              <w:left w:val="single" w:color="CCCCCC" w:sz="0" w:space="0"/>
+              <w:bottom w:val="single" w:color="CCCCCC" w:sz="0" w:space="0"/>
+              <w:right w:val="single" w:color="CCCCCC" w:sz="0" w:space="0"/>
+            </w:tcBorders>
+            <w:shd w:val="clear" w:color="auto" w:fill="1F4E79"/>
+            <w:tcMar>
+              <w:top w:w="60" w:type="dxa"/>
+              <w:left w:w="100" w:type="dxa"/>
+              <w:bottom w:w="60" w:type="dxa"/>
+              <w:right w:w="100" w:type="dxa"/>
+            </w:tcMar>
+          </w:tcPr>
+          <w:p>
+            <w:r>
+              <w:rPr>
+                <w:rFonts w:ascii="Arial" w:hAnsi="Arial" w:eastAsia="Arial" w:cs="Arial"/>
+                <w:b/>
+                <w:bCs/>
+                <w:color w:val="FFFFFF"/>
+                <w:sz w:val="18"/>
+                <w:szCs w:val="18"/>
+              </w:rPr>
+              <w:t>Figure</w:t>
+            </w:r>
+          </w:p>
+        </w:tc>
+        <w:tc>
+          <w:tcPr>
+            <w:tcW w:w="3300" w:type="dxa"/>
+            <w:tcBorders>
+              <w:top w:val="single" w:color="CCCCCC" w:sz="0" w:space="0"/>
+              <w:left w:val="single" w:color="CCCCCC" w:sz="0" w:space="0"/>
+              <w:bottom w:val="single" w:color="CCCCCC" w:sz="0" w:space="0"/>
+              <w:right w:val="single" w:color="CCCCCC" w:sz="0" w:space="0"/>
+            </w:tcBorders>
+            <w:shd w:val="clear" w:color="auto" w:fill="1F4E79"/>
+            <w:tcMar>
+              <w:top w:w="60" w:type="dxa"/>
+              <w:left w:w="100" w:type="dxa"/>
+              <w:bottom w:w="60" w:type="dxa"/>
+              <w:right w:w="100" w:type="dxa"/>
+            </w:tcMar>
+          </w:tcPr>
+          <w:p>
+            <w:r>
+              <w:rPr>
+                <w:rFonts w:ascii="Arial" w:hAnsi="Arial" w:eastAsia="Arial" w:cs="Arial"/>
+                <w:b/>
+                <w:bCs/>
+                <w:color w:val="FFFFFF"/>
+                <w:sz w:val="18"/>
+                <w:szCs w:val="18"/>
+              </w:rPr>
+              <w:t>File</w:t>
+            </w:r>
+          </w:p>
+        </w:tc>
+        <w:tc>
+          <w:tcPr>
+            <w:tcW w:w="5160" w:type="dxa"/>
+            <w:tcBorders>
+              <w:top w:val="single" w:color="CCCCCC" w:sz="0" w:space="0"/>
+              <w:left w:val="single" w:color="CCCCCC" w:sz="0" w:space="0"/>
+              <w:bottom w:val="single" w:color="CCCCCC" w:sz="0" w:space="0"/>
+              <w:right w:val="single" w:color="CCCCCC" w:sz="0" w:space="0"/>
+            </w:tcBorders>
+            <w:shd w:val="clear" w:color="auto" w:fill="1F4E79"/>
+            <w:tcMar>
+              <w:top w:w="60" w:type="dxa"/>
+              <w:left w:w="100" w:type="dxa"/>
+              <w:bottom w:w="60" w:type="dxa"/>
+              <w:right w:w="100" w:type="dxa"/>
+            </w:tcMar>
+          </w:tcPr>
+          <w:p>
+            <w:r>
+              <w:rPr>
+                <w:rFonts w:ascii="Arial" w:hAnsi="Arial" w:eastAsia="Arial" w:cs="Arial"/>
+                <w:b/>
+                <w:bCs/>
+                <w:color w:val="FFFFFF"/>
+                <w:sz w:val="18"/>
+                <w:szCs w:val="18"/>
+              </w:rPr>
+              <w:t>Claim supported</w:t>
+            </w:r>
+          </w:p>
+        </w:tc>
+      </w:tr>
+      <w:tr>
+        <w:tblPrEx>
+          <w:tblBorders>
+            <w:top w:val="single" w:color="auto" w:sz="4" w:space="0"/>
+            <w:left w:val="single" w:color="auto" w:sz="4" w:space="0"/>
+            <w:bottom w:val="single" w:color="auto" w:sz="4" w:space="0"/>
+            <w:right w:val="single" w:color="auto" w:sz="4" w:space="0"/>
+            <w:insideH w:val="single" w:color="auto" w:sz="4" w:space="0"/>
+            <w:insideV w:val="single" w:color="auto" w:sz="4" w:space="0"/>
+          </w:tblBorders>
+          <w:tblCellMar>
+            <w:top w:w="0" w:type="dxa"/>
+            <w:left w:w="10" w:type="dxa"/>
+            <w:bottom w:w="0" w:type="dxa"/>
+            <w:right w:w="10" w:type="dxa"/>
+          </w:tblCellMar>
+        </w:tblPrEx>
+        <w:tc>
+          <w:tcPr>
+            <w:tcW w:w="900" w:type="dxa"/>
+            <w:tcBorders>
+              <w:top w:val="single" w:color="CCCCCC" w:sz="0" w:space="0"/>
+              <w:left w:val="single" w:color="CCCCCC" w:sz="0" w:space="0"/>
+              <w:bottom w:val="single" w:color="CCCCCC" w:sz="0" w:space="0"/>
+              <w:right w:val="single" w:color="CCCCCC" w:sz="0" w:space="0"/>
+            </w:tcBorders>
+            <w:tcMar>
+              <w:top w:w="60" w:type="dxa"/>
+              <w:left w:w="100" w:type="dxa"/>
+              <w:bottom w:w="60" w:type="dxa"/>
+              <w:right w:w="100" w:type="dxa"/>
+            </w:tcMar>
+          </w:tcPr>
+          <w:p>
+            <w:pPr>
+              <w:jc w:val="left"/>
+            </w:pPr>
+            <w:r>
+              <w:rPr>
+                <w:rFonts w:ascii="Arial" w:hAnsi="Arial" w:eastAsia="Arial" w:cs="Arial"/>
+                <w:b/>
+                <w:bCs/>
+                <w:sz w:val="18"/>
+                <w:szCs w:val="18"/>
+              </w:rPr>
+              <w:t>1</w:t>
+            </w:r>
+          </w:p>
+        </w:tc>
+        <w:tc>
+          <w:tcPr>
+            <w:tcW w:w="3300" w:type="dxa"/>
+            <w:tcBorders>
+              <w:top w:val="single" w:color="CCCCCC" w:sz="0" w:space="0"/>
+              <w:left w:val="single" w:color="CCCCCC" w:sz="0" w:space="0"/>
+              <w:bottom w:val="single" w:color="CCCCCC" w:sz="0" w:space="0"/>
+              <w:right w:val="single" w:color="CCCCCC" w:sz="0" w:space="0"/>
+            </w:tcBorders>
+            <w:tcMar>
+              <w:top w:w="60" w:type="dxa"/>
+              <w:left w:w="100" w:type="dxa"/>
+              <w:bottom w:w="60" w:type="dxa"/>
+              <w:right w:w="100" w:type="dxa"/>
+            </w:tcMar>
+          </w:tcPr>
+          <w:p>
+            <w:pPr>
+              <w:jc w:val="left"/>
+            </w:pPr>
+            <w:r>
+              <w:rPr>
+                <w:rFonts w:ascii="Arial" w:hAnsi="Arial" w:eastAsia="Arial" w:cs="Arial"/>
+                <w:b w:val="0"/>
+                <w:bCs w:val="0"/>
+                <w:sz w:val="18"/>
+                <w:szCs w:val="18"/>
+              </w:rPr>
+              <w:t>block1_q1_fig01_pipeline.png</w:t>
+            </w:r>
+          </w:p>
+        </w:tc>
+        <w:tc>
+          <w:tcPr>
+            <w:tcW w:w="5160" w:type="dxa"/>
+            <w:tcBorders>
+              <w:top w:val="single" w:color="CCCCCC" w:sz="0" w:space="0"/>
+              <w:left w:val="single" w:color="CCCCCC" w:sz="0" w:space="0"/>
+              <w:bottom w:val="single" w:color="CCCCCC" w:sz="0" w:space="0"/>
+              <w:right w:val="single" w:color="CCCCCC" w:sz="0" w:space="0"/>
+            </w:tcBorders>
+            <w:tcMar>
+              <w:top w:w="60" w:type="dxa"/>
+              <w:left w:w="100" w:type="dxa"/>
+              <w:bottom w:w="60" w:type="dxa"/>
+              <w:right w:w="100" w:type="dxa"/>
+            </w:tcMar>
+          </w:tcPr>
+          <w:p>
+            <w:pPr>
+              <w:jc w:val="left"/>
+            </w:pPr>
+            <w:r>
+              <w:rPr>
+                <w:rFonts w:ascii="Arial" w:hAnsi="Arial" w:eastAsia="Arial" w:cs="Arial"/>
+                <w:b w:val="0"/>
+                <w:bCs w:val="0"/>
+                <w:sz w:val="18"/>
+                <w:szCs w:val="18"/>
+              </w:rPr>
+              <w:t>End-to-end Block 1 workflow from BOPTEST telemetry to live validation.</w:t>
+            </w:r>
+          </w:p>
+        </w:tc>
+      </w:tr>
+      <w:tr>
+        <w:tblPrEx>
+          <w:tblBorders>
+            <w:top w:val="single" w:color="auto" w:sz="4" w:space="0"/>
+            <w:left w:val="single" w:color="auto" w:sz="4" w:space="0"/>
+            <w:bottom w:val="single" w:color="auto" w:sz="4" w:space="0"/>
+            <w:right w:val="single" w:color="auto" w:sz="4" w:space="0"/>
+            <w:insideH w:val="single" w:color="auto" w:sz="4" w:space="0"/>
+            <w:insideV w:val="single" w:color="auto" w:sz="4" w:space="0"/>
+          </w:tblBorders>
+          <w:tblCellMar>
+            <w:top w:w="0" w:type="dxa"/>
+            <w:left w:w="10" w:type="dxa"/>
+            <w:bottom w:w="0" w:type="dxa"/>
+            <w:right w:w="10" w:type="dxa"/>
+          </w:tblCellMar>
+        </w:tblPrEx>
+        <w:tc>
+          <w:tcPr>
+            <w:tcW w:w="900" w:type="dxa"/>
+            <w:tcBorders>
+              <w:top w:val="single" w:color="CCCCCC" w:sz="0" w:space="0"/>
+              <w:left w:val="single" w:color="CCCCCC" w:sz="0" w:space="0"/>
+              <w:bottom w:val="single" w:color="CCCCCC" w:sz="0" w:space="0"/>
+              <w:right w:val="single" w:color="CCCCCC" w:sz="0" w:space="0"/>
+            </w:tcBorders>
+            <w:shd w:val="clear" w:color="auto" w:fill="F2F7FB"/>
+            <w:tcMar>
+              <w:top w:w="60" w:type="dxa"/>
+              <w:left w:w="100" w:type="dxa"/>
+              <w:bottom w:w="60" w:type="dxa"/>
+              <w:right w:w="100" w:type="dxa"/>
+            </w:tcMar>
+          </w:tcPr>
+          <w:p>
+            <w:pPr>
+              <w:jc w:val="left"/>
+            </w:pPr>
+            <w:r>
+              <w:rPr>
+                <w:rFonts w:ascii="Arial" w:hAnsi="Arial" w:eastAsia="Arial" w:cs="Arial"/>
+                <w:b/>
+                <w:bCs/>
+                <w:sz w:val="18"/>
+                <w:szCs w:val="18"/>
+              </w:rPr>
+              <w:t>2</w:t>
+            </w:r>
+          </w:p>
+        </w:tc>
+        <w:tc>
+          <w:tcPr>
+            <w:tcW w:w="3300" w:type="dxa"/>
+            <w:tcBorders>
+              <w:top w:val="single" w:color="CCCCCC" w:sz="0" w:space="0"/>
+              <w:left w:val="single" w:color="CCCCCC" w:sz="0" w:space="0"/>
+              <w:bottom w:val="single" w:color="CCCCCC" w:sz="0" w:space="0"/>
+              <w:right w:val="single" w:color="CCCCCC" w:sz="0" w:space="0"/>
+            </w:tcBorders>
+            <w:shd w:val="clear" w:color="auto" w:fill="F2F7FB"/>
+            <w:tcMar>
+              <w:top w:w="60" w:type="dxa"/>
+              <w:left w:w="100" w:type="dxa"/>
+              <w:bottom w:w="60" w:type="dxa"/>
+              <w:right w:w="100" w:type="dxa"/>
+            </w:tcMar>
+          </w:tcPr>
+          <w:p>
+            <w:pPr>
+              <w:jc w:val="left"/>
+            </w:pPr>
+            <w:r>
+              <w:rPr>
+                <w:rFonts w:ascii="Arial" w:hAnsi="Arial" w:eastAsia="Arial" w:cs="Arial"/>
+                <w:b w:val="0"/>
+                <w:bCs w:val="0"/>
+                <w:sz w:val="18"/>
+                <w:szCs w:val="18"/>
+              </w:rPr>
+              <w:t>block1_q1_fig02_v3_dual_head.png</w:t>
+            </w:r>
+          </w:p>
+        </w:tc>
+        <w:tc>
+          <w:tcPr>
+            <w:tcW w:w="5160" w:type="dxa"/>
+            <w:tcBorders>
+              <w:top w:val="single" w:color="CCCCCC" w:sz="0" w:space="0"/>
+              <w:left w:val="single" w:color="CCCCCC" w:sz="0" w:space="0"/>
+              <w:bottom w:val="single" w:color="CCCCCC" w:sz="0" w:space="0"/>
+              <w:right w:val="single" w:color="CCCCCC" w:sz="0" w:space="0"/>
+            </w:tcBorders>
+            <w:shd w:val="clear" w:color="auto" w:fill="F2F7FB"/>
+            <w:tcMar>
+              <w:top w:w="60" w:type="dxa"/>
+              <w:left w:w="100" w:type="dxa"/>
+              <w:bottom w:w="60" w:type="dxa"/>
+              <w:right w:w="100" w:type="dxa"/>
+            </w:tcMar>
+          </w:tcPr>
+          <w:p>
+            <w:pPr>
+              <w:jc w:val="left"/>
+            </w:pPr>
+            <w:r>
+              <w:rPr>
+                <w:rFonts w:ascii="Arial" w:hAnsi="Arial" w:eastAsia="Arial" w:cs="Arial"/>
+                <w:b w:val="0"/>
+                <w:bCs w:val="0"/>
+                <w:sz w:val="18"/>
+                <w:szCs w:val="18"/>
+              </w:rPr>
+              <w:t>Compact dual-head v3 architecture and its two prediction heads.</w:t>
+            </w:r>
+          </w:p>
+        </w:tc>
+      </w:tr>
+      <w:tr>
+        <w:tblPrEx>
+          <w:tblBorders>
+            <w:top w:val="single" w:color="auto" w:sz="4" w:space="0"/>
+            <w:left w:val="single" w:color="auto" w:sz="4" w:space="0"/>
+            <w:bottom w:val="single" w:color="auto" w:sz="4" w:space="0"/>
+            <w:right w:val="single" w:color="auto" w:sz="4" w:space="0"/>
+            <w:insideH w:val="single" w:color="auto" w:sz="4" w:space="0"/>
+            <w:insideV w:val="single" w:color="auto" w:sz="4" w:space="0"/>
+          </w:tblBorders>
+          <w:tblCellMar>
+            <w:top w:w="0" w:type="dxa"/>
+            <w:left w:w="10" w:type="dxa"/>
+            <w:bottom w:w="0" w:type="dxa"/>
+            <w:right w:w="10" w:type="dxa"/>
+          </w:tblCellMar>
+        </w:tblPrEx>
+        <w:tc>
+          <w:tcPr>
+            <w:tcW w:w="900" w:type="dxa"/>
+            <w:tcBorders>
+              <w:top w:val="single" w:color="CCCCCC" w:sz="0" w:space="0"/>
+              <w:left w:val="single" w:color="CCCCCC" w:sz="0" w:space="0"/>
+              <w:bottom w:val="single" w:color="CCCCCC" w:sz="0" w:space="0"/>
+              <w:right w:val="single" w:color="CCCCCC" w:sz="0" w:space="0"/>
+            </w:tcBorders>
+            <w:tcMar>
+              <w:top w:w="60" w:type="dxa"/>
+              <w:left w:w="100" w:type="dxa"/>
+              <w:bottom w:w="60" w:type="dxa"/>
+              <w:right w:w="100" w:type="dxa"/>
+            </w:tcMar>
+          </w:tcPr>
+          <w:p>
+            <w:pPr>
+              <w:jc w:val="left"/>
+            </w:pPr>
+            <w:r>
+              <w:rPr>
+                <w:rFonts w:ascii="Arial" w:hAnsi="Arial" w:eastAsia="Arial" w:cs="Arial"/>
+                <w:b/>
+                <w:bCs/>
+                <w:sz w:val="18"/>
+                <w:szCs w:val="18"/>
+              </w:rPr>
+              <w:t>3</w:t>
+            </w:r>
+          </w:p>
+        </w:tc>
+        <w:tc>
+          <w:tcPr>
+            <w:tcW w:w="3300" w:type="dxa"/>
+            <w:tcBorders>
+              <w:top w:val="single" w:color="CCCCCC" w:sz="0" w:space="0"/>
+              <w:left w:val="single" w:color="CCCCCC" w:sz="0" w:space="0"/>
+              <w:bottom w:val="single" w:color="CCCCCC" w:sz="0" w:space="0"/>
+              <w:right w:val="single" w:color="CCCCCC" w:sz="0" w:space="0"/>
+            </w:tcBorders>
+            <w:tcMar>
+              <w:top w:w="60" w:type="dxa"/>
+              <w:left w:w="100" w:type="dxa"/>
+              <w:bottom w:w="60" w:type="dxa"/>
+              <w:right w:w="100" w:type="dxa"/>
+            </w:tcMar>
+          </w:tcPr>
+          <w:p>
+            <w:pPr>
+              <w:jc w:val="left"/>
+            </w:pPr>
+            <w:r>
+              <w:rPr>
+                <w:rFonts w:ascii="Arial" w:hAnsi="Arial" w:eastAsia="Arial" w:cs="Arial"/>
+                <w:b w:val="0"/>
+                <w:bCs w:val="0"/>
+                <w:sz w:val="18"/>
+                <w:szCs w:val="18"/>
+              </w:rPr>
+              <w:t>block1_q1_fig03_stage_abc_improvement.png</w:t>
+            </w:r>
+          </w:p>
+        </w:tc>
+        <w:tc>
+          <w:tcPr>
+            <w:tcW w:w="5160" w:type="dxa"/>
+            <w:tcBorders>
+              <w:top w:val="single" w:color="CCCCCC" w:sz="0" w:space="0"/>
+              <w:left w:val="single" w:color="CCCCCC" w:sz="0" w:space="0"/>
+              <w:bottom w:val="single" w:color="CCCCCC" w:sz="0" w:space="0"/>
+              <w:right w:val="single" w:color="CCCCCC" w:sz="0" w:space="0"/>
+            </w:tcBorders>
+            <w:tcMar>
+              <w:top w:w="60" w:type="dxa"/>
+              <w:left w:w="100" w:type="dxa"/>
+              <w:bottom w:w="60" w:type="dxa"/>
+              <w:right w:w="100" w:type="dxa"/>
+            </w:tcMar>
+          </w:tcPr>
+          <w:p>
+            <w:pPr>
+              <w:jc w:val="left"/>
+            </w:pPr>
+            <w:r>
+              <w:rPr>
+                <w:rFonts w:ascii="Arial" w:hAnsi="Arial" w:eastAsia="Arial" w:cs="Arial"/>
+                <w:b w:val="0"/>
+                <w:bCs w:val="0"/>
+                <w:sz w:val="18"/>
+                <w:szCs w:val="18"/>
+              </w:rPr>
+              <w:t>Before/after effect of Stage A/B/C on temperature and power fidelity.</w:t>
+            </w:r>
+          </w:p>
+        </w:tc>
+      </w:tr>
+      <w:tr>
+        <w:tblPrEx>
+          <w:tblBorders>
+            <w:top w:val="single" w:color="auto" w:sz="4" w:space="0"/>
+            <w:left w:val="single" w:color="auto" w:sz="4" w:space="0"/>
+            <w:bottom w:val="single" w:color="auto" w:sz="4" w:space="0"/>
+            <w:right w:val="single" w:color="auto" w:sz="4" w:space="0"/>
+            <w:insideH w:val="single" w:color="auto" w:sz="4" w:space="0"/>
+            <w:insideV w:val="single" w:color="auto" w:sz="4" w:space="0"/>
+          </w:tblBorders>
+          <w:tblCellMar>
+            <w:top w:w="0" w:type="dxa"/>
+            <w:left w:w="10" w:type="dxa"/>
+            <w:bottom w:w="0" w:type="dxa"/>
+            <w:right w:w="10" w:type="dxa"/>
+          </w:tblCellMar>
+        </w:tblPrEx>
+        <w:tc>
+          <w:tcPr>
+            <w:tcW w:w="900" w:type="dxa"/>
+            <w:tcBorders>
+              <w:top w:val="single" w:color="CCCCCC" w:sz="0" w:space="0"/>
+              <w:left w:val="single" w:color="CCCCCC" w:sz="0" w:space="0"/>
+              <w:bottom w:val="single" w:color="CCCCCC" w:sz="0" w:space="0"/>
+              <w:right w:val="single" w:color="CCCCCC" w:sz="0" w:space="0"/>
+            </w:tcBorders>
+            <w:shd w:val="clear" w:color="auto" w:fill="F2F7FB"/>
+            <w:tcMar>
+              <w:top w:w="60" w:type="dxa"/>
+              <w:left w:w="100" w:type="dxa"/>
+              <w:bottom w:w="60" w:type="dxa"/>
+              <w:right w:w="100" w:type="dxa"/>
+            </w:tcMar>
+          </w:tcPr>
+          <w:p>
+            <w:pPr>
+              <w:jc w:val="left"/>
+            </w:pPr>
+            <w:r>
+              <w:rPr>
+                <w:rFonts w:ascii="Arial" w:hAnsi="Arial" w:eastAsia="Arial" w:cs="Arial"/>
+                <w:b/>
+                <w:bCs/>
+                <w:sz w:val="18"/>
+                <w:szCs w:val="18"/>
+              </w:rPr>
+              <w:t>4</w:t>
+            </w:r>
+          </w:p>
+        </w:tc>
+        <w:tc>
+          <w:tcPr>
+            <w:tcW w:w="3300" w:type="dxa"/>
+            <w:tcBorders>
+              <w:top w:val="single" w:color="CCCCCC" w:sz="0" w:space="0"/>
+              <w:left w:val="single" w:color="CCCCCC" w:sz="0" w:space="0"/>
+              <w:bottom w:val="single" w:color="CCCCCC" w:sz="0" w:space="0"/>
+              <w:right w:val="single" w:color="CCCCCC" w:sz="0" w:space="0"/>
+            </w:tcBorders>
+            <w:shd w:val="clear" w:color="auto" w:fill="F2F7FB"/>
+            <w:tcMar>
+              <w:top w:w="60" w:type="dxa"/>
+              <w:left w:w="100" w:type="dxa"/>
+              <w:bottom w:w="60" w:type="dxa"/>
+              <w:right w:w="100" w:type="dxa"/>
+            </w:tcMar>
+          </w:tcPr>
+          <w:p>
+            <w:pPr>
+              <w:jc w:val="left"/>
+            </w:pPr>
+            <w:r>
+              <w:rPr>
+                <w:rFonts w:ascii="Arial" w:hAnsi="Arial" w:eastAsia="Arial" w:cs="Arial"/>
+                <w:b w:val="0"/>
+                <w:bCs w:val="0"/>
+                <w:sz w:val="18"/>
+                <w:szCs w:val="18"/>
+              </w:rPr>
+              <w:t>block1_q1_fig04_czon_identification.png</w:t>
+            </w:r>
+          </w:p>
+        </w:tc>
+        <w:tc>
+          <w:tcPr>
+            <w:tcW w:w="5160" w:type="dxa"/>
+            <w:tcBorders>
+              <w:top w:val="single" w:color="CCCCCC" w:sz="0" w:space="0"/>
+              <w:left w:val="single" w:color="CCCCCC" w:sz="0" w:space="0"/>
+              <w:bottom w:val="single" w:color="CCCCCC" w:sz="0" w:space="0"/>
+              <w:right w:val="single" w:color="CCCCCC" w:sz="0" w:space="0"/>
+            </w:tcBorders>
+            <w:shd w:val="clear" w:color="auto" w:fill="F2F7FB"/>
+            <w:tcMar>
+              <w:top w:w="60" w:type="dxa"/>
+              <w:left w:w="100" w:type="dxa"/>
+              <w:bottom w:w="60" w:type="dxa"/>
+              <w:right w:w="100" w:type="dxa"/>
+            </w:tcMar>
+          </w:tcPr>
+          <w:p>
+            <w:pPr>
+              <w:jc w:val="left"/>
+            </w:pPr>
+            <w:r>
+              <w:rPr>
+                <w:rFonts w:ascii="Arial" w:hAnsi="Arial" w:eastAsia="Arial" w:cs="Arial"/>
+                <w:b w:val="0"/>
+                <w:bCs w:val="0"/>
+                <w:sz w:val="18"/>
+                <w:szCs w:val="18"/>
+              </w:rPr>
+              <w:t>Bayesian inverse trajectory of C_zon during Stage B.</w:t>
+            </w:r>
+          </w:p>
+        </w:tc>
+      </w:tr>
+      <w:tr>
+        <w:tblPrEx>
+          <w:tblBorders>
+            <w:top w:val="single" w:color="auto" w:sz="4" w:space="0"/>
+            <w:left w:val="single" w:color="auto" w:sz="4" w:space="0"/>
+            <w:bottom w:val="single" w:color="auto" w:sz="4" w:space="0"/>
+            <w:right w:val="single" w:color="auto" w:sz="4" w:space="0"/>
+            <w:insideH w:val="single" w:color="auto" w:sz="4" w:space="0"/>
+            <w:insideV w:val="single" w:color="auto" w:sz="4" w:space="0"/>
+          </w:tblBorders>
+          <w:tblCellMar>
+            <w:top w:w="0" w:type="dxa"/>
+            <w:left w:w="10" w:type="dxa"/>
+            <w:bottom w:w="0" w:type="dxa"/>
+            <w:right w:w="10" w:type="dxa"/>
+          </w:tblCellMar>
+        </w:tblPrEx>
+        <w:tc>
+          <w:tcPr>
+            <w:tcW w:w="900" w:type="dxa"/>
+            <w:tcBorders>
+              <w:top w:val="single" w:color="CCCCCC" w:sz="0" w:space="0"/>
+              <w:left w:val="single" w:color="CCCCCC" w:sz="0" w:space="0"/>
+              <w:bottom w:val="single" w:color="CCCCCC" w:sz="0" w:space="0"/>
+              <w:right w:val="single" w:color="CCCCCC" w:sz="0" w:space="0"/>
+            </w:tcBorders>
+            <w:tcMar>
+              <w:top w:w="60" w:type="dxa"/>
+              <w:left w:w="100" w:type="dxa"/>
+              <w:bottom w:w="60" w:type="dxa"/>
+              <w:right w:w="100" w:type="dxa"/>
+            </w:tcMar>
+          </w:tcPr>
+          <w:p>
+            <w:pPr>
+              <w:jc w:val="left"/>
+            </w:pPr>
+            <w:r>
+              <w:rPr>
+                <w:rFonts w:ascii="Arial" w:hAnsi="Arial" w:eastAsia="Arial" w:cs="Arial"/>
+                <w:b/>
+                <w:bCs/>
+                <w:sz w:val="18"/>
+                <w:szCs w:val="18"/>
+              </w:rPr>
+              <w:t>5</w:t>
+            </w:r>
+          </w:p>
+        </w:tc>
+        <w:tc>
+          <w:tcPr>
+            <w:tcW w:w="3300" w:type="dxa"/>
+            <w:tcBorders>
+              <w:top w:val="single" w:color="CCCCCC" w:sz="0" w:space="0"/>
+              <w:left w:val="single" w:color="CCCCCC" w:sz="0" w:space="0"/>
+              <w:bottom w:val="single" w:color="CCCCCC" w:sz="0" w:space="0"/>
+              <w:right w:val="single" w:color="CCCCCC" w:sz="0" w:space="0"/>
+            </w:tcBorders>
+            <w:tcMar>
+              <w:top w:w="60" w:type="dxa"/>
+              <w:left w:w="100" w:type="dxa"/>
+              <w:bottom w:w="60" w:type="dxa"/>
+              <w:right w:w="100" w:type="dxa"/>
+            </w:tcMar>
+          </w:tcPr>
+          <w:p>
+            <w:pPr>
+              <w:jc w:val="left"/>
+            </w:pPr>
+            <w:r>
+              <w:rPr>
+                <w:rFonts w:ascii="Arial" w:hAnsi="Arial" w:eastAsia="Arial" w:cs="Arial"/>
+                <w:b w:val="0"/>
+                <w:bCs w:val="0"/>
+                <w:sz w:val="18"/>
+                <w:szCs w:val="18"/>
+              </w:rPr>
+              <w:t>block1_q1_fig05_matched_corpus_rmse.png</w:t>
+            </w:r>
+          </w:p>
+        </w:tc>
+        <w:tc>
+          <w:tcPr>
+            <w:tcW w:w="5160" w:type="dxa"/>
+            <w:tcBorders>
+              <w:top w:val="single" w:color="CCCCCC" w:sz="0" w:space="0"/>
+              <w:left w:val="single" w:color="CCCCCC" w:sz="0" w:space="0"/>
+              <w:bottom w:val="single" w:color="CCCCCC" w:sz="0" w:space="0"/>
+              <w:right w:val="single" w:color="CCCCCC" w:sz="0" w:space="0"/>
+            </w:tcBorders>
+            <w:tcMar>
+              <w:top w:w="60" w:type="dxa"/>
+              <w:left w:w="100" w:type="dxa"/>
+              <w:bottom w:w="60" w:type="dxa"/>
+              <w:right w:w="100" w:type="dxa"/>
+            </w:tcMar>
+          </w:tcPr>
+          <w:p>
+            <w:pPr>
+              <w:jc w:val="left"/>
+            </w:pPr>
+            <w:r>
+              <w:rPr>
+                <w:rFonts w:ascii="Arial" w:hAnsi="Arial" w:eastAsia="Arial" w:cs="Arial"/>
+                <w:b w:val="0"/>
+                <w:bCs w:val="0"/>
+                <w:sz w:val="18"/>
+                <w:szCs w:val="18"/>
+              </w:rPr>
+              <w:t>Corpus-controlled 24h RMSE comparison across four variants.</w:t>
+            </w:r>
+          </w:p>
+        </w:tc>
+      </w:tr>
+      <w:tr>
+        <w:tblPrEx>
+          <w:tblBorders>
+            <w:top w:val="single" w:color="auto" w:sz="4" w:space="0"/>
+            <w:left w:val="single" w:color="auto" w:sz="4" w:space="0"/>
+            <w:bottom w:val="single" w:color="auto" w:sz="4" w:space="0"/>
+            <w:right w:val="single" w:color="auto" w:sz="4" w:space="0"/>
+            <w:insideH w:val="single" w:color="auto" w:sz="4" w:space="0"/>
+            <w:insideV w:val="single" w:color="auto" w:sz="4" w:space="0"/>
+          </w:tblBorders>
+          <w:tblCellMar>
+            <w:top w:w="0" w:type="dxa"/>
+            <w:left w:w="10" w:type="dxa"/>
+            <w:bottom w:w="0" w:type="dxa"/>
+            <w:right w:w="10" w:type="dxa"/>
+          </w:tblCellMar>
+        </w:tblPrEx>
+        <w:tc>
+          <w:tcPr>
+            <w:tcW w:w="900" w:type="dxa"/>
+            <w:tcBorders>
+              <w:top w:val="single" w:color="CCCCCC" w:sz="0" w:space="0"/>
+              <w:left w:val="single" w:color="CCCCCC" w:sz="0" w:space="0"/>
+              <w:bottom w:val="single" w:color="CCCCCC" w:sz="0" w:space="0"/>
+              <w:right w:val="single" w:color="CCCCCC" w:sz="0" w:space="0"/>
+            </w:tcBorders>
+            <w:shd w:val="clear" w:color="auto" w:fill="F2F7FB"/>
+            <w:tcMar>
+              <w:top w:w="60" w:type="dxa"/>
+              <w:left w:w="100" w:type="dxa"/>
+              <w:bottom w:w="60" w:type="dxa"/>
+              <w:right w:w="100" w:type="dxa"/>
+            </w:tcMar>
+          </w:tcPr>
+          <w:p>
+            <w:pPr>
+              <w:jc w:val="left"/>
+            </w:pPr>
+            <w:r>
+              <w:rPr>
+                <w:rFonts w:ascii="Arial" w:hAnsi="Arial" w:eastAsia="Arial" w:cs="Arial"/>
+                <w:b/>
+                <w:bCs/>
+                <w:sz w:val="18"/>
+                <w:szCs w:val="18"/>
+              </w:rPr>
+              <w:t>6</w:t>
+            </w:r>
+          </w:p>
+        </w:tc>
+        <w:tc>
+          <w:tcPr>
+            <w:tcW w:w="3300" w:type="dxa"/>
+            <w:tcBorders>
+              <w:top w:val="single" w:color="CCCCCC" w:sz="0" w:space="0"/>
+              <w:left w:val="single" w:color="CCCCCC" w:sz="0" w:space="0"/>
+              <w:bottom w:val="single" w:color="CCCCCC" w:sz="0" w:space="0"/>
+              <w:right w:val="single" w:color="CCCCCC" w:sz="0" w:space="0"/>
+            </w:tcBorders>
+            <w:shd w:val="clear" w:color="auto" w:fill="F2F7FB"/>
+            <w:tcMar>
+              <w:top w:w="60" w:type="dxa"/>
+              <w:left w:w="100" w:type="dxa"/>
+              <w:bottom w:w="60" w:type="dxa"/>
+              <w:right w:w="100" w:type="dxa"/>
+            </w:tcMar>
+          </w:tcPr>
+          <w:p>
+            <w:pPr>
+              <w:jc w:val="left"/>
+            </w:pPr>
+            <w:r>
+              <w:rPr>
+                <w:rFonts w:ascii="Arial" w:hAnsi="Arial" w:eastAsia="Arial" w:cs="Arial"/>
+                <w:b w:val="0"/>
+                <w:bCs w:val="0"/>
+                <w:sz w:val="18"/>
+                <w:szCs w:val="18"/>
+              </w:rPr>
+              <w:t>block1_q1_fig06_fidelity_gain_waterfall.png</w:t>
+            </w:r>
+          </w:p>
+        </w:tc>
+        <w:tc>
+          <w:tcPr>
+            <w:tcW w:w="5160" w:type="dxa"/>
+            <w:tcBorders>
+              <w:top w:val="single" w:color="CCCCCC" w:sz="0" w:space="0"/>
+              <w:left w:val="single" w:color="CCCCCC" w:sz="0" w:space="0"/>
+              <w:bottom w:val="single" w:color="CCCCCC" w:sz="0" w:space="0"/>
+              <w:right w:val="single" w:color="CCCCCC" w:sz="0" w:space="0"/>
+            </w:tcBorders>
+            <w:shd w:val="clear" w:color="auto" w:fill="F2F7FB"/>
+            <w:tcMar>
+              <w:top w:w="60" w:type="dxa"/>
+              <w:left w:w="100" w:type="dxa"/>
+              <w:bottom w:w="60" w:type="dxa"/>
+              <w:right w:w="100" w:type="dxa"/>
+            </w:tcMar>
+          </w:tcPr>
+          <w:p>
+            <w:pPr>
+              <w:jc w:val="left"/>
+            </w:pPr>
+            <w:r>
+              <w:rPr>
+                <w:rFonts w:ascii="Arial" w:hAnsi="Arial" w:eastAsia="Arial" w:cs="Arial"/>
+                <w:b w:val="0"/>
+                <w:bCs w:val="0"/>
+                <w:sz w:val="18"/>
+                <w:szCs w:val="18"/>
+              </w:rPr>
+              <w:t>Attribution of the v3-to-v3.5 gain to corpus shift and calibration.</w:t>
+            </w:r>
+          </w:p>
+        </w:tc>
+      </w:tr>
+      <w:tr>
+        <w:tblPrEx>
+          <w:tblBorders>
+            <w:top w:val="single" w:color="auto" w:sz="4" w:space="0"/>
+            <w:left w:val="single" w:color="auto" w:sz="4" w:space="0"/>
+            <w:bottom w:val="single" w:color="auto" w:sz="4" w:space="0"/>
+            <w:right w:val="single" w:color="auto" w:sz="4" w:space="0"/>
+            <w:insideH w:val="single" w:color="auto" w:sz="4" w:space="0"/>
+            <w:insideV w:val="single" w:color="auto" w:sz="4" w:space="0"/>
+          </w:tblBorders>
+          <w:tblCellMar>
+            <w:top w:w="0" w:type="dxa"/>
+            <w:left w:w="10" w:type="dxa"/>
+            <w:bottom w:w="0" w:type="dxa"/>
+            <w:right w:w="10" w:type="dxa"/>
+          </w:tblCellMar>
+        </w:tblPrEx>
+        <w:tc>
+          <w:tcPr>
+            <w:tcW w:w="900" w:type="dxa"/>
+            <w:tcBorders>
+              <w:top w:val="single" w:color="CCCCCC" w:sz="0" w:space="0"/>
+              <w:left w:val="single" w:color="CCCCCC" w:sz="0" w:space="0"/>
+              <w:bottom w:val="single" w:color="CCCCCC" w:sz="0" w:space="0"/>
+              <w:right w:val="single" w:color="CCCCCC" w:sz="0" w:space="0"/>
+            </w:tcBorders>
+            <w:tcMar>
+              <w:top w:w="60" w:type="dxa"/>
+              <w:left w:w="100" w:type="dxa"/>
+              <w:bottom w:w="60" w:type="dxa"/>
+              <w:right w:w="100" w:type="dxa"/>
+            </w:tcMar>
+          </w:tcPr>
+          <w:p>
+            <w:pPr>
+              <w:jc w:val="left"/>
+            </w:pPr>
+            <w:r>
+              <w:rPr>
+                <w:rFonts w:ascii="Arial" w:hAnsi="Arial" w:eastAsia="Arial" w:cs="Arial"/>
+                <w:b/>
+                <w:bCs/>
+                <w:sz w:val="18"/>
+                <w:szCs w:val="18"/>
+              </w:rPr>
+              <w:t>7</w:t>
+            </w:r>
+          </w:p>
+        </w:tc>
+        <w:tc>
+          <w:tcPr>
+            <w:tcW w:w="3300" w:type="dxa"/>
+            <w:tcBorders>
+              <w:top w:val="single" w:color="CCCCCC" w:sz="0" w:space="0"/>
+              <w:left w:val="single" w:color="CCCCCC" w:sz="0" w:space="0"/>
+              <w:bottom w:val="single" w:color="CCCCCC" w:sz="0" w:space="0"/>
+              <w:right w:val="single" w:color="CCCCCC" w:sz="0" w:space="0"/>
+            </w:tcBorders>
+            <w:tcMar>
+              <w:top w:w="60" w:type="dxa"/>
+              <w:left w:w="100" w:type="dxa"/>
+              <w:bottom w:w="60" w:type="dxa"/>
+              <w:right w:w="100" w:type="dxa"/>
+            </w:tcMar>
+          </w:tcPr>
+          <w:p>
+            <w:pPr>
+              <w:jc w:val="left"/>
+            </w:pPr>
+            <w:r>
+              <w:rPr>
+                <w:rFonts w:ascii="Arial" w:hAnsi="Arial" w:eastAsia="Arial" w:cs="Arial"/>
+                <w:b w:val="0"/>
+                <w:bCs w:val="0"/>
+                <w:sz w:val="18"/>
+                <w:szCs w:val="18"/>
+              </w:rPr>
+              <w:t>block1_q1_fig07_fidelity_vs_rl_utility.png</w:t>
+            </w:r>
+          </w:p>
+        </w:tc>
+        <w:tc>
+          <w:tcPr>
+            <w:tcW w:w="5160" w:type="dxa"/>
+            <w:tcBorders>
+              <w:top w:val="single" w:color="CCCCCC" w:sz="0" w:space="0"/>
+              <w:left w:val="single" w:color="CCCCCC" w:sz="0" w:space="0"/>
+              <w:bottom w:val="single" w:color="CCCCCC" w:sz="0" w:space="0"/>
+              <w:right w:val="single" w:color="CCCCCC" w:sz="0" w:space="0"/>
+            </w:tcBorders>
+            <w:tcMar>
+              <w:top w:w="60" w:type="dxa"/>
+              <w:left w:w="100" w:type="dxa"/>
+              <w:bottom w:w="60" w:type="dxa"/>
+              <w:right w:w="100" w:type="dxa"/>
+            </w:tcMar>
+          </w:tcPr>
+          <w:p>
+            <w:pPr>
+              <w:jc w:val="left"/>
+            </w:pPr>
+            <w:r>
+              <w:rPr>
+                <w:rFonts w:ascii="Arial" w:hAnsi="Arial" w:eastAsia="Arial" w:cs="Arial"/>
+                <w:b w:val="0"/>
+                <w:bCs w:val="0"/>
+                <w:sz w:val="18"/>
+                <w:szCs w:val="18"/>
+              </w:rPr>
+              <w:t>Predictive fidelity vs live RL training utility paradox.</w:t>
+            </w:r>
+          </w:p>
+        </w:tc>
+      </w:tr>
+      <w:tr>
+        <w:tblPrEx>
+          <w:tblBorders>
+            <w:top w:val="single" w:color="auto" w:sz="4" w:space="0"/>
+            <w:left w:val="single" w:color="auto" w:sz="4" w:space="0"/>
+            <w:bottom w:val="single" w:color="auto" w:sz="4" w:space="0"/>
+            <w:right w:val="single" w:color="auto" w:sz="4" w:space="0"/>
+            <w:insideH w:val="single" w:color="auto" w:sz="4" w:space="0"/>
+            <w:insideV w:val="single" w:color="auto" w:sz="4" w:space="0"/>
+          </w:tblBorders>
+          <w:tblCellMar>
+            <w:top w:w="0" w:type="dxa"/>
+            <w:left w:w="10" w:type="dxa"/>
+            <w:bottom w:w="0" w:type="dxa"/>
+            <w:right w:w="10" w:type="dxa"/>
+          </w:tblCellMar>
+        </w:tblPrEx>
+        <w:tc>
+          <w:tcPr>
+            <w:tcW w:w="900" w:type="dxa"/>
+            <w:tcBorders>
+              <w:top w:val="single" w:color="CCCCCC" w:sz="0" w:space="0"/>
+              <w:left w:val="single" w:color="CCCCCC" w:sz="0" w:space="0"/>
+              <w:bottom w:val="single" w:color="CCCCCC" w:sz="0" w:space="0"/>
+              <w:right w:val="single" w:color="CCCCCC" w:sz="0" w:space="0"/>
+            </w:tcBorders>
+            <w:shd w:val="clear" w:color="auto" w:fill="F2F7FB"/>
+            <w:tcMar>
+              <w:top w:w="60" w:type="dxa"/>
+              <w:left w:w="100" w:type="dxa"/>
+              <w:bottom w:w="60" w:type="dxa"/>
+              <w:right w:w="100" w:type="dxa"/>
+            </w:tcMar>
+          </w:tcPr>
+          <w:p>
+            <w:pPr>
+              <w:jc w:val="left"/>
+            </w:pPr>
+            <w:r>
+              <w:rPr>
+                <w:rFonts w:ascii="Arial" w:hAnsi="Arial" w:eastAsia="Arial" w:cs="Arial"/>
+                <w:b/>
+                <w:bCs/>
+                <w:sz w:val="18"/>
+                <w:szCs w:val="18"/>
+              </w:rPr>
+              <w:t>8</w:t>
+            </w:r>
+          </w:p>
+        </w:tc>
+        <w:tc>
+          <w:tcPr>
+            <w:tcW w:w="3300" w:type="dxa"/>
+            <w:tcBorders>
+              <w:top w:val="single" w:color="CCCCCC" w:sz="0" w:space="0"/>
+              <w:left w:val="single" w:color="CCCCCC" w:sz="0" w:space="0"/>
+              <w:bottom w:val="single" w:color="CCCCCC" w:sz="0" w:space="0"/>
+              <w:right w:val="single" w:color="CCCCCC" w:sz="0" w:space="0"/>
+            </w:tcBorders>
+            <w:shd w:val="clear" w:color="auto" w:fill="F2F7FB"/>
+            <w:tcMar>
+              <w:top w:w="60" w:type="dxa"/>
+              <w:left w:w="100" w:type="dxa"/>
+              <w:bottom w:w="60" w:type="dxa"/>
+              <w:right w:w="100" w:type="dxa"/>
+            </w:tcMar>
+          </w:tcPr>
+          <w:p>
+            <w:pPr>
+              <w:jc w:val="left"/>
+            </w:pPr>
+            <w:r>
+              <w:rPr>
+                <w:rFonts w:ascii="Arial" w:hAnsi="Arial" w:eastAsia="Arial" w:cs="Arial"/>
+                <w:b w:val="0"/>
+                <w:bCs w:val="0"/>
+                <w:sz w:val="18"/>
+                <w:szCs w:val="18"/>
+              </w:rPr>
+              <w:t>block1_q1_fig08_live_boptest_performance.png</w:t>
+            </w:r>
+          </w:p>
+        </w:tc>
+        <w:tc>
+          <w:tcPr>
+            <w:tcW w:w="5160" w:type="dxa"/>
+            <w:tcBorders>
+              <w:top w:val="single" w:color="CCCCCC" w:sz="0" w:space="0"/>
+              <w:left w:val="single" w:color="CCCCCC" w:sz="0" w:space="0"/>
+              <w:bottom w:val="single" w:color="CCCCCC" w:sz="0" w:space="0"/>
+              <w:right w:val="single" w:color="CCCCCC" w:sz="0" w:space="0"/>
+            </w:tcBorders>
+            <w:shd w:val="clear" w:color="auto" w:fill="F2F7FB"/>
+            <w:tcMar>
+              <w:top w:w="60" w:type="dxa"/>
+              <w:left w:w="100" w:type="dxa"/>
+              <w:bottom w:w="60" w:type="dxa"/>
+              <w:right w:w="100" w:type="dxa"/>
+            </w:tcMar>
+          </w:tcPr>
+          <w:p>
+            <w:pPr>
+              <w:jc w:val="left"/>
+            </w:pPr>
+            <w:r>
+              <w:rPr>
+                <w:rFonts w:ascii="Arial" w:hAnsi="Arial" w:eastAsia="Arial" w:cs="Arial"/>
+                <w:b w:val="0"/>
+                <w:bCs w:val="0"/>
+                <w:sz w:val="18"/>
+                <w:szCs w:val="18"/>
+              </w:rPr>
+              <w:t>Live BOPTEST maintenance score and energy comparison.</w:t>
+            </w:r>
+          </w:p>
+        </w:tc>
+      </w:tr>
+      <w:tr>
+        <w:tblPrEx>
+          <w:tblBorders>
+            <w:top w:val="single" w:color="auto" w:sz="4" w:space="0"/>
+            <w:left w:val="single" w:color="auto" w:sz="4" w:space="0"/>
+            <w:bottom w:val="single" w:color="auto" w:sz="4" w:space="0"/>
+            <w:right w:val="single" w:color="auto" w:sz="4" w:space="0"/>
+            <w:insideH w:val="single" w:color="auto" w:sz="4" w:space="0"/>
+            <w:insideV w:val="single" w:color="auto" w:sz="4" w:space="0"/>
+          </w:tblBorders>
+          <w:tblCellMar>
+            <w:top w:w="0" w:type="dxa"/>
+            <w:left w:w="10" w:type="dxa"/>
+            <w:bottom w:w="0" w:type="dxa"/>
+            <w:right w:w="10" w:type="dxa"/>
+          </w:tblCellMar>
+        </w:tblPrEx>
+        <w:tc>
+          <w:tcPr>
+            <w:tcW w:w="900" w:type="dxa"/>
+            <w:tcBorders>
+              <w:top w:val="single" w:color="CCCCCC" w:sz="0" w:space="0"/>
+              <w:left w:val="single" w:color="CCCCCC" w:sz="0" w:space="0"/>
+              <w:bottom w:val="single" w:color="CCCCCC" w:sz="0" w:space="0"/>
+              <w:right w:val="single" w:color="CCCCCC" w:sz="0" w:space="0"/>
+            </w:tcBorders>
+            <w:tcMar>
+              <w:top w:w="60" w:type="dxa"/>
+              <w:left w:w="100" w:type="dxa"/>
+              <w:bottom w:w="60" w:type="dxa"/>
+              <w:right w:w="100" w:type="dxa"/>
+            </w:tcMar>
+          </w:tcPr>
+          <w:p>
+            <w:pPr>
+              <w:jc w:val="left"/>
+            </w:pPr>
+            <w:r>
+              <w:rPr>
+                <w:rFonts w:ascii="Arial" w:hAnsi="Arial" w:eastAsia="Arial" w:cs="Arial"/>
+                <w:b/>
+                <w:bCs/>
+                <w:sz w:val="18"/>
+                <w:szCs w:val="18"/>
+              </w:rPr>
+              <w:t>9</w:t>
+            </w:r>
+          </w:p>
+        </w:tc>
+        <w:tc>
+          <w:tcPr>
+            <w:tcW w:w="3300" w:type="dxa"/>
+            <w:tcBorders>
+              <w:top w:val="single" w:color="CCCCCC" w:sz="0" w:space="0"/>
+              <w:left w:val="single" w:color="CCCCCC" w:sz="0" w:space="0"/>
+              <w:bottom w:val="single" w:color="CCCCCC" w:sz="0" w:space="0"/>
+              <w:right w:val="single" w:color="CCCCCC" w:sz="0" w:space="0"/>
+            </w:tcBorders>
+            <w:tcMar>
+              <w:top w:w="60" w:type="dxa"/>
+              <w:left w:w="100" w:type="dxa"/>
+              <w:bottom w:w="60" w:type="dxa"/>
+              <w:right w:w="100" w:type="dxa"/>
+            </w:tcMar>
+          </w:tcPr>
+          <w:p>
+            <w:pPr>
+              <w:jc w:val="left"/>
+            </w:pPr>
+            <w:r>
+              <w:rPr>
+                <w:rFonts w:ascii="Arial" w:hAnsi="Arial" w:eastAsia="Arial" w:cs="Arial"/>
+                <w:b w:val="0"/>
+                <w:bCs w:val="0"/>
+                <w:sz w:val="18"/>
+                <w:szCs w:val="18"/>
+              </w:rPr>
+              <w:t>block1_q1_fig09_backend_speed.png</w:t>
+            </w:r>
+          </w:p>
+        </w:tc>
+        <w:tc>
+          <w:tcPr>
+            <w:tcW w:w="5160" w:type="dxa"/>
+            <w:tcBorders>
+              <w:top w:val="single" w:color="CCCCCC" w:sz="0" w:space="0"/>
+              <w:left w:val="single" w:color="CCCCCC" w:sz="0" w:space="0"/>
+              <w:bottom w:val="single" w:color="CCCCCC" w:sz="0" w:space="0"/>
+              <w:right w:val="single" w:color="CCCCCC" w:sz="0" w:space="0"/>
+            </w:tcBorders>
+            <w:tcMar>
+              <w:top w:w="60" w:type="dxa"/>
+              <w:left w:w="100" w:type="dxa"/>
+              <w:bottom w:w="60" w:type="dxa"/>
+              <w:right w:w="100" w:type="dxa"/>
+            </w:tcMar>
+          </w:tcPr>
+          <w:p>
+            <w:pPr>
+              <w:jc w:val="left"/>
+            </w:pPr>
+            <w:r>
+              <w:rPr>
+                <w:rFonts w:ascii="Arial" w:hAnsi="Arial" w:eastAsia="Arial" w:cs="Arial"/>
+                <w:b w:val="0"/>
+                <w:bCs w:val="0"/>
+                <w:sz w:val="18"/>
+                <w:szCs w:val="18"/>
+              </w:rPr>
+              <w:t>BOPTEST vs surrogate throughput on log-scale.</w:t>
+            </w:r>
+          </w:p>
+        </w:tc>
+      </w:tr>
+      <w:tr>
+        <w:tblPrEx>
+          <w:tblBorders>
+            <w:top w:val="single" w:color="auto" w:sz="4" w:space="0"/>
+            <w:left w:val="single" w:color="auto" w:sz="4" w:space="0"/>
+            <w:bottom w:val="single" w:color="auto" w:sz="4" w:space="0"/>
+            <w:right w:val="single" w:color="auto" w:sz="4" w:space="0"/>
+            <w:insideH w:val="single" w:color="auto" w:sz="4" w:space="0"/>
+            <w:insideV w:val="single" w:color="auto" w:sz="4" w:space="0"/>
+          </w:tblBorders>
+          <w:tblCellMar>
+            <w:top w:w="0" w:type="dxa"/>
+            <w:left w:w="10" w:type="dxa"/>
+            <w:bottom w:w="0" w:type="dxa"/>
+            <w:right w:w="10" w:type="dxa"/>
+          </w:tblCellMar>
+        </w:tblPrEx>
+        <w:tc>
+          <w:tcPr>
+            <w:tcW w:w="900" w:type="dxa"/>
+            <w:tcBorders>
+              <w:top w:val="single" w:color="CCCCCC" w:sz="0" w:space="0"/>
+              <w:left w:val="single" w:color="CCCCCC" w:sz="0" w:space="0"/>
+              <w:bottom w:val="single" w:color="CCCCCC" w:sz="0" w:space="0"/>
+              <w:right w:val="single" w:color="CCCCCC" w:sz="0" w:space="0"/>
+            </w:tcBorders>
+            <w:shd w:val="clear" w:color="auto" w:fill="F2F7FB"/>
+            <w:tcMar>
+              <w:top w:w="60" w:type="dxa"/>
+              <w:left w:w="100" w:type="dxa"/>
+              <w:bottom w:w="60" w:type="dxa"/>
+              <w:right w:w="100" w:type="dxa"/>
+            </w:tcMar>
+          </w:tcPr>
+          <w:p>
+            <w:pPr>
+              <w:jc w:val="left"/>
+            </w:pPr>
+            <w:r>
+              <w:rPr>
+                <w:rFonts w:ascii="Arial" w:hAnsi="Arial" w:eastAsia="Arial" w:cs="Arial"/>
+                <w:b/>
+                <w:bCs/>
+                <w:sz w:val="18"/>
+                <w:szCs w:val="18"/>
+              </w:rPr>
+              <w:t>10</w:t>
+            </w:r>
+          </w:p>
+        </w:tc>
+        <w:tc>
+          <w:tcPr>
+            <w:tcW w:w="3300" w:type="dxa"/>
+            <w:tcBorders>
+              <w:top w:val="single" w:color="CCCCCC" w:sz="0" w:space="0"/>
+              <w:left w:val="single" w:color="CCCCCC" w:sz="0" w:space="0"/>
+              <w:bottom w:val="single" w:color="CCCCCC" w:sz="0" w:space="0"/>
+              <w:right w:val="single" w:color="CCCCCC" w:sz="0" w:space="0"/>
+            </w:tcBorders>
+            <w:shd w:val="clear" w:color="auto" w:fill="F2F7FB"/>
+            <w:tcMar>
+              <w:top w:w="60" w:type="dxa"/>
+              <w:left w:w="100" w:type="dxa"/>
+              <w:bottom w:w="60" w:type="dxa"/>
+              <w:right w:w="100" w:type="dxa"/>
+            </w:tcMar>
+          </w:tcPr>
+          <w:p>
+            <w:pPr>
+              <w:jc w:val="left"/>
+            </w:pPr>
+            <w:r>
+              <w:rPr>
+                <w:rFonts w:ascii="Arial" w:hAnsi="Arial" w:eastAsia="Arial" w:cs="Arial"/>
+                <w:b w:val="0"/>
+                <w:bCs w:val="0"/>
+                <w:sz w:val="18"/>
+                <w:szCs w:val="18"/>
+              </w:rPr>
+              <w:t>block1_q1_fig10_transfer_gap_diagnostics.png</w:t>
+            </w:r>
+          </w:p>
+        </w:tc>
+        <w:tc>
+          <w:tcPr>
+            <w:tcW w:w="5160" w:type="dxa"/>
+            <w:tcBorders>
+              <w:top w:val="single" w:color="CCCCCC" w:sz="0" w:space="0"/>
+              <w:left w:val="single" w:color="CCCCCC" w:sz="0" w:space="0"/>
+              <w:bottom w:val="single" w:color="CCCCCC" w:sz="0" w:space="0"/>
+              <w:right w:val="single" w:color="CCCCCC" w:sz="0" w:space="0"/>
+            </w:tcBorders>
+            <w:shd w:val="clear" w:color="auto" w:fill="F2F7FB"/>
+            <w:tcMar>
+              <w:top w:w="60" w:type="dxa"/>
+              <w:left w:w="100" w:type="dxa"/>
+              <w:bottom w:w="60" w:type="dxa"/>
+              <w:right w:w="100" w:type="dxa"/>
+            </w:tcMar>
+          </w:tcPr>
+          <w:p>
+            <w:pPr>
+              <w:jc w:val="left"/>
+            </w:pPr>
+            <w:r>
+              <w:rPr>
+                <w:rFonts w:ascii="Arial" w:hAnsi="Arial" w:eastAsia="Arial" w:cs="Arial"/>
+                <w:b w:val="0"/>
+                <w:bCs w:val="0"/>
+                <w:sz w:val="18"/>
+                <w:szCs w:val="18"/>
+              </w:rPr>
+              <w:t>Violation, action-gap, and first-divergence diagnostics.</w:t>
+            </w:r>
+          </w:p>
+        </w:tc>
+      </w:tr>
+      <w:tr>
+        <w:tblPrEx>
+          <w:tblBorders>
+            <w:top w:val="single" w:color="auto" w:sz="4" w:space="0"/>
+            <w:left w:val="single" w:color="auto" w:sz="4" w:space="0"/>
+            <w:bottom w:val="single" w:color="auto" w:sz="4" w:space="0"/>
+            <w:right w:val="single" w:color="auto" w:sz="4" w:space="0"/>
+            <w:insideH w:val="single" w:color="auto" w:sz="4" w:space="0"/>
+            <w:insideV w:val="single" w:color="auto" w:sz="4" w:space="0"/>
+          </w:tblBorders>
+          <w:tblCellMar>
+            <w:top w:w="0" w:type="dxa"/>
+            <w:left w:w="10" w:type="dxa"/>
+            <w:bottom w:w="0" w:type="dxa"/>
+            <w:right w:w="10" w:type="dxa"/>
+          </w:tblCellMar>
+        </w:tblPrEx>
+        <w:tc>
+          <w:tcPr>
+            <w:tcW w:w="900" w:type="dxa"/>
+            <w:tcBorders>
+              <w:top w:val="single" w:color="CCCCCC" w:sz="0" w:space="0"/>
+              <w:left w:val="single" w:color="CCCCCC" w:sz="0" w:space="0"/>
+              <w:bottom w:val="single" w:color="CCCCCC" w:sz="0" w:space="0"/>
+              <w:right w:val="single" w:color="CCCCCC" w:sz="0" w:space="0"/>
+            </w:tcBorders>
+            <w:tcMar>
+              <w:top w:w="60" w:type="dxa"/>
+              <w:left w:w="100" w:type="dxa"/>
+              <w:bottom w:w="60" w:type="dxa"/>
+              <w:right w:w="100" w:type="dxa"/>
+            </w:tcMar>
+          </w:tcPr>
+          <w:p>
+            <w:pPr>
+              <w:jc w:val="left"/>
+            </w:pPr>
+            <w:r>
+              <w:rPr>
+                <w:rFonts w:ascii="Arial" w:hAnsi="Arial" w:eastAsia="Arial" w:cs="Arial"/>
+                <w:b/>
+                <w:bCs/>
+                <w:sz w:val="18"/>
+                <w:szCs w:val="18"/>
+              </w:rPr>
+              <w:t>11</w:t>
+            </w:r>
+          </w:p>
+        </w:tc>
+        <w:tc>
+          <w:tcPr>
+            <w:tcW w:w="3300" w:type="dxa"/>
+            <w:tcBorders>
+              <w:top w:val="single" w:color="CCCCCC" w:sz="0" w:space="0"/>
+              <w:left w:val="single" w:color="CCCCCC" w:sz="0" w:space="0"/>
+              <w:bottom w:val="single" w:color="CCCCCC" w:sz="0" w:space="0"/>
+              <w:right w:val="single" w:color="CCCCCC" w:sz="0" w:space="0"/>
+            </w:tcBorders>
+            <w:tcMar>
+              <w:top w:w="60" w:type="dxa"/>
+              <w:left w:w="100" w:type="dxa"/>
+              <w:bottom w:w="60" w:type="dxa"/>
+              <w:right w:w="100" w:type="dxa"/>
+            </w:tcMar>
+          </w:tcPr>
+          <w:p>
+            <w:pPr>
+              <w:jc w:val="left"/>
+            </w:pPr>
+            <w:r>
+              <w:rPr>
+                <w:rFonts w:ascii="Arial" w:hAnsi="Arial" w:eastAsia="Arial" w:cs="Arial"/>
+                <w:b w:val="0"/>
+                <w:bCs w:val="0"/>
+                <w:sz w:val="18"/>
+                <w:szCs w:val="18"/>
+              </w:rPr>
+              <w:t>block1_q1_fig11_action_saturation.png</w:t>
+            </w:r>
+          </w:p>
+        </w:tc>
+        <w:tc>
+          <w:tcPr>
+            <w:tcW w:w="5160" w:type="dxa"/>
+            <w:tcBorders>
+              <w:top w:val="single" w:color="CCCCCC" w:sz="0" w:space="0"/>
+              <w:left w:val="single" w:color="CCCCCC" w:sz="0" w:space="0"/>
+              <w:bottom w:val="single" w:color="CCCCCC" w:sz="0" w:space="0"/>
+              <w:right w:val="single" w:color="CCCCCC" w:sz="0" w:space="0"/>
+            </w:tcBorders>
+            <w:tcMar>
+              <w:top w:w="60" w:type="dxa"/>
+              <w:left w:w="100" w:type="dxa"/>
+              <w:bottom w:w="60" w:type="dxa"/>
+              <w:right w:w="100" w:type="dxa"/>
+            </w:tcMar>
+          </w:tcPr>
+          <w:p>
+            <w:pPr>
+              <w:jc w:val="left"/>
+            </w:pPr>
+            <w:r>
+              <w:rPr>
+                <w:rFonts w:ascii="Arial" w:hAnsi="Arial" w:eastAsia="Arial" w:cs="Arial"/>
+                <w:b w:val="0"/>
+                <w:bCs w:val="0"/>
+                <w:sz w:val="18"/>
+                <w:szCs w:val="18"/>
+              </w:rPr>
+              <w:t>Raw action distribution showing direct-v3.5 saturation.</w:t>
+            </w:r>
+          </w:p>
+        </w:tc>
+      </w:tr>
+      <w:tr>
+        <w:tblPrEx>
+          <w:tblBorders>
+            <w:top w:val="single" w:color="auto" w:sz="4" w:space="0"/>
+            <w:left w:val="single" w:color="auto" w:sz="4" w:space="0"/>
+            <w:bottom w:val="single" w:color="auto" w:sz="4" w:space="0"/>
+            <w:right w:val="single" w:color="auto" w:sz="4" w:space="0"/>
+            <w:insideH w:val="single" w:color="auto" w:sz="4" w:space="0"/>
+            <w:insideV w:val="single" w:color="auto" w:sz="4" w:space="0"/>
+          </w:tblBorders>
+          <w:tblCellMar>
+            <w:top w:w="0" w:type="dxa"/>
+            <w:left w:w="10" w:type="dxa"/>
+            <w:bottom w:w="0" w:type="dxa"/>
+            <w:right w:w="10" w:type="dxa"/>
+          </w:tblCellMar>
+        </w:tblPrEx>
+        <w:tc>
+          <w:tcPr>
+            <w:tcW w:w="900" w:type="dxa"/>
+            <w:tcBorders>
+              <w:top w:val="single" w:color="CCCCCC" w:sz="0" w:space="0"/>
+              <w:left w:val="single" w:color="CCCCCC" w:sz="0" w:space="0"/>
+              <w:bottom w:val="single" w:color="CCCCCC" w:sz="0" w:space="0"/>
+              <w:right w:val="single" w:color="CCCCCC" w:sz="0" w:space="0"/>
+            </w:tcBorders>
+            <w:shd w:val="clear" w:color="auto" w:fill="F2F7FB"/>
+            <w:tcMar>
+              <w:top w:w="60" w:type="dxa"/>
+              <w:left w:w="100" w:type="dxa"/>
+              <w:bottom w:w="60" w:type="dxa"/>
+              <w:right w:w="100" w:type="dxa"/>
+            </w:tcMar>
+          </w:tcPr>
+          <w:p>
+            <w:pPr>
+              <w:jc w:val="left"/>
+            </w:pPr>
+            <w:r>
+              <w:rPr>
+                <w:rFonts w:ascii="Arial" w:hAnsi="Arial" w:eastAsia="Arial" w:cs="Arial"/>
+                <w:b/>
+                <w:bCs/>
+                <w:sz w:val="18"/>
+                <w:szCs w:val="18"/>
+              </w:rPr>
+              <w:t>12</w:t>
+            </w:r>
+          </w:p>
+        </w:tc>
+        <w:tc>
+          <w:tcPr>
+            <w:tcW w:w="3300" w:type="dxa"/>
+            <w:tcBorders>
+              <w:top w:val="single" w:color="CCCCCC" w:sz="0" w:space="0"/>
+              <w:left w:val="single" w:color="CCCCCC" w:sz="0" w:space="0"/>
+              <w:bottom w:val="single" w:color="CCCCCC" w:sz="0" w:space="0"/>
+              <w:right w:val="single" w:color="CCCCCC" w:sz="0" w:space="0"/>
+            </w:tcBorders>
+            <w:shd w:val="clear" w:color="auto" w:fill="F2F7FB"/>
+            <w:tcMar>
+              <w:top w:w="60" w:type="dxa"/>
+              <w:left w:w="100" w:type="dxa"/>
+              <w:bottom w:w="60" w:type="dxa"/>
+              <w:right w:w="100" w:type="dxa"/>
+            </w:tcMar>
+          </w:tcPr>
+          <w:p>
+            <w:pPr>
+              <w:jc w:val="left"/>
+            </w:pPr>
+            <w:r>
+              <w:rPr>
+                <w:rFonts w:ascii="Arial" w:hAnsi="Arial" w:eastAsia="Arial" w:cs="Arial"/>
+                <w:b w:val="0"/>
+                <w:bCs w:val="0"/>
+                <w:sz w:val="18"/>
+                <w:szCs w:val="18"/>
+              </w:rPr>
+              <w:t>block1_q1_fig12_per_episode_rmse.png</w:t>
+            </w:r>
+          </w:p>
+        </w:tc>
+        <w:tc>
+          <w:tcPr>
+            <w:tcW w:w="5160" w:type="dxa"/>
+            <w:tcBorders>
+              <w:top w:val="single" w:color="CCCCCC" w:sz="0" w:space="0"/>
+              <w:left w:val="single" w:color="CCCCCC" w:sz="0" w:space="0"/>
+              <w:bottom w:val="single" w:color="CCCCCC" w:sz="0" w:space="0"/>
+              <w:right w:val="single" w:color="CCCCCC" w:sz="0" w:space="0"/>
+            </w:tcBorders>
+            <w:shd w:val="clear" w:color="auto" w:fill="F2F7FB"/>
+            <w:tcMar>
+              <w:top w:w="60" w:type="dxa"/>
+              <w:left w:w="100" w:type="dxa"/>
+              <w:bottom w:w="60" w:type="dxa"/>
+              <w:right w:w="100" w:type="dxa"/>
+            </w:tcMar>
+          </w:tcPr>
+          <w:p>
+            <w:pPr>
+              <w:jc w:val="left"/>
+            </w:pPr>
+            <w:r>
+              <w:rPr>
+                <w:rFonts w:ascii="Arial" w:hAnsi="Arial" w:eastAsia="Arial" w:cs="Arial"/>
+                <w:b w:val="0"/>
+                <w:bCs w:val="0"/>
+                <w:sz w:val="18"/>
+                <w:szCs w:val="18"/>
+              </w:rPr>
+              <w:t>Episode-wise replicative validity across held-out BOPTEST episodes.</w:t>
+            </w:r>
+          </w:p>
+        </w:tc>
+      </w:tr>
+      <w:tr>
+        <w:tblPrEx>
+          <w:tblBorders>
+            <w:top w:val="single" w:color="auto" w:sz="4" w:space="0"/>
+            <w:left w:val="single" w:color="auto" w:sz="4" w:space="0"/>
+            <w:bottom w:val="single" w:color="auto" w:sz="4" w:space="0"/>
+            <w:right w:val="single" w:color="auto" w:sz="4" w:space="0"/>
+            <w:insideH w:val="single" w:color="auto" w:sz="4" w:space="0"/>
+            <w:insideV w:val="single" w:color="auto" w:sz="4" w:space="0"/>
+          </w:tblBorders>
+          <w:tblCellMar>
+            <w:top w:w="0" w:type="dxa"/>
+            <w:left w:w="10" w:type="dxa"/>
+            <w:bottom w:w="0" w:type="dxa"/>
+            <w:right w:w="10" w:type="dxa"/>
+          </w:tblCellMar>
+        </w:tblPrEx>
+        <w:tc>
+          <w:tcPr>
+            <w:tcW w:w="900" w:type="dxa"/>
+            <w:tcBorders>
+              <w:top w:val="single" w:color="CCCCCC" w:sz="0" w:space="0"/>
+              <w:left w:val="single" w:color="CCCCCC" w:sz="0" w:space="0"/>
+              <w:bottom w:val="single" w:color="CCCCCC" w:sz="0" w:space="0"/>
+              <w:right w:val="single" w:color="CCCCCC" w:sz="0" w:space="0"/>
+            </w:tcBorders>
+            <w:tcMar>
+              <w:top w:w="60" w:type="dxa"/>
+              <w:left w:w="100" w:type="dxa"/>
+              <w:bottom w:w="60" w:type="dxa"/>
+              <w:right w:w="100" w:type="dxa"/>
+            </w:tcMar>
+          </w:tcPr>
+          <w:p>
+            <w:pPr>
+              <w:jc w:val="left"/>
+            </w:pPr>
+            <w:r>
+              <w:rPr>
+                <w:rFonts w:ascii="Arial" w:hAnsi="Arial" w:eastAsia="Arial" w:cs="Arial"/>
+                <w:b/>
+                <w:bCs/>
+                <w:sz w:val="18"/>
+                <w:szCs w:val="18"/>
+              </w:rPr>
+              <w:t>13</w:t>
+            </w:r>
+          </w:p>
+        </w:tc>
+        <w:tc>
+          <w:tcPr>
+            <w:tcW w:w="3300" w:type="dxa"/>
+            <w:tcBorders>
+              <w:top w:val="single" w:color="CCCCCC" w:sz="0" w:space="0"/>
+              <w:left w:val="single" w:color="CCCCCC" w:sz="0" w:space="0"/>
+              <w:bottom w:val="single" w:color="CCCCCC" w:sz="0" w:space="0"/>
+              <w:right w:val="single" w:color="CCCCCC" w:sz="0" w:space="0"/>
+            </w:tcBorders>
+            <w:tcMar>
+              <w:top w:w="60" w:type="dxa"/>
+              <w:left w:w="100" w:type="dxa"/>
+              <w:bottom w:w="60" w:type="dxa"/>
+              <w:right w:w="100" w:type="dxa"/>
+            </w:tcMar>
+          </w:tcPr>
+          <w:p>
+            <w:pPr>
+              <w:jc w:val="left"/>
+            </w:pPr>
+            <w:r>
+              <w:rPr>
+                <w:rFonts w:ascii="Arial" w:hAnsi="Arial" w:eastAsia="Arial" w:cs="Arial"/>
+                <w:b w:val="0"/>
+                <w:bCs w:val="0"/>
+                <w:sz w:val="18"/>
+                <w:szCs w:val="18"/>
+              </w:rPr>
+              <w:t>block1_q1_fig13_residual_distributions.png</w:t>
+            </w:r>
+          </w:p>
+        </w:tc>
+        <w:tc>
+          <w:tcPr>
+            <w:tcW w:w="5160" w:type="dxa"/>
+            <w:tcBorders>
+              <w:top w:val="single" w:color="CCCCCC" w:sz="0" w:space="0"/>
+              <w:left w:val="single" w:color="CCCCCC" w:sz="0" w:space="0"/>
+              <w:bottom w:val="single" w:color="CCCCCC" w:sz="0" w:space="0"/>
+              <w:right w:val="single" w:color="CCCCCC" w:sz="0" w:space="0"/>
+            </w:tcBorders>
+            <w:tcMar>
+              <w:top w:w="60" w:type="dxa"/>
+              <w:left w:w="100" w:type="dxa"/>
+              <w:bottom w:w="60" w:type="dxa"/>
+              <w:right w:w="100" w:type="dxa"/>
+            </w:tcMar>
+          </w:tcPr>
+          <w:p>
+            <w:pPr>
+              <w:jc w:val="left"/>
+            </w:pPr>
+            <w:r>
+              <w:rPr>
+                <w:rFonts w:ascii="Arial" w:hAnsi="Arial" w:eastAsia="Arial" w:cs="Arial"/>
+                <w:b w:val="0"/>
+                <w:bCs w:val="0"/>
+                <w:sz w:val="18"/>
+                <w:szCs w:val="18"/>
+              </w:rPr>
+              <w:t>Temperature residual distribution before and after calibration.</w:t>
+            </w:r>
+          </w:p>
+        </w:tc>
+      </w:tr>
+      <w:tr>
+        <w:tblPrEx>
+          <w:tblBorders>
+            <w:top w:val="single" w:color="auto" w:sz="4" w:space="0"/>
+            <w:left w:val="single" w:color="auto" w:sz="4" w:space="0"/>
+            <w:bottom w:val="single" w:color="auto" w:sz="4" w:space="0"/>
+            <w:right w:val="single" w:color="auto" w:sz="4" w:space="0"/>
+            <w:insideH w:val="single" w:color="auto" w:sz="4" w:space="0"/>
+            <w:insideV w:val="single" w:color="auto" w:sz="4" w:space="0"/>
+          </w:tblBorders>
+          <w:tblCellMar>
+            <w:top w:w="0" w:type="dxa"/>
+            <w:left w:w="10" w:type="dxa"/>
+            <w:bottom w:w="0" w:type="dxa"/>
+            <w:right w:w="10" w:type="dxa"/>
+          </w:tblCellMar>
+        </w:tblPrEx>
+        <w:tc>
+          <w:tcPr>
+            <w:tcW w:w="900" w:type="dxa"/>
+            <w:tcBorders>
+              <w:top w:val="single" w:color="CCCCCC" w:sz="0" w:space="0"/>
+              <w:left w:val="single" w:color="CCCCCC" w:sz="0" w:space="0"/>
+              <w:bottom w:val="single" w:color="CCCCCC" w:sz="0" w:space="0"/>
+              <w:right w:val="single" w:color="CCCCCC" w:sz="0" w:space="0"/>
+            </w:tcBorders>
+            <w:shd w:val="clear" w:color="auto" w:fill="F2F7FB"/>
+            <w:tcMar>
+              <w:top w:w="60" w:type="dxa"/>
+              <w:left w:w="100" w:type="dxa"/>
+              <w:bottom w:w="60" w:type="dxa"/>
+              <w:right w:w="100" w:type="dxa"/>
+            </w:tcMar>
+          </w:tcPr>
+          <w:p>
+            <w:pPr>
+              <w:jc w:val="left"/>
+            </w:pPr>
+            <w:r>
+              <w:rPr>
+                <w:rFonts w:ascii="Arial" w:hAnsi="Arial" w:eastAsia="Arial" w:cs="Arial"/>
+                <w:b/>
+                <w:bCs/>
+                <w:sz w:val="18"/>
+                <w:szCs w:val="18"/>
+              </w:rPr>
+              <w:t>14</w:t>
+            </w:r>
+          </w:p>
+        </w:tc>
+        <w:tc>
+          <w:tcPr>
+            <w:tcW w:w="3300" w:type="dxa"/>
+            <w:tcBorders>
+              <w:top w:val="single" w:color="CCCCCC" w:sz="0" w:space="0"/>
+              <w:left w:val="single" w:color="CCCCCC" w:sz="0" w:space="0"/>
+              <w:bottom w:val="single" w:color="CCCCCC" w:sz="0" w:space="0"/>
+              <w:right w:val="single" w:color="CCCCCC" w:sz="0" w:space="0"/>
+            </w:tcBorders>
+            <w:shd w:val="clear" w:color="auto" w:fill="F2F7FB"/>
+            <w:tcMar>
+              <w:top w:w="60" w:type="dxa"/>
+              <w:left w:w="100" w:type="dxa"/>
+              <w:bottom w:w="60" w:type="dxa"/>
+              <w:right w:w="100" w:type="dxa"/>
+            </w:tcMar>
+          </w:tcPr>
+          <w:p>
+            <w:pPr>
+              <w:jc w:val="left"/>
+            </w:pPr>
+            <w:r>
+              <w:rPr>
+                <w:rFonts w:ascii="Arial" w:hAnsi="Arial" w:eastAsia="Arial" w:cs="Arial"/>
+                <w:b w:val="0"/>
+                <w:bCs w:val="0"/>
+                <w:sz w:val="18"/>
+                <w:szCs w:val="18"/>
+              </w:rPr>
+              <w:t>block1_q1_fig14_hybrid_loss.png</w:t>
+            </w:r>
+          </w:p>
+        </w:tc>
+        <w:tc>
+          <w:tcPr>
+            <w:tcW w:w="5160" w:type="dxa"/>
+            <w:tcBorders>
+              <w:top w:val="single" w:color="CCCCCC" w:sz="0" w:space="0"/>
+              <w:left w:val="single" w:color="CCCCCC" w:sz="0" w:space="0"/>
+              <w:bottom w:val="single" w:color="CCCCCC" w:sz="0" w:space="0"/>
+              <w:right w:val="single" w:color="CCCCCC" w:sz="0" w:space="0"/>
+            </w:tcBorders>
+            <w:shd w:val="clear" w:color="auto" w:fill="F2F7FB"/>
+            <w:tcMar>
+              <w:top w:w="60" w:type="dxa"/>
+              <w:left w:w="100" w:type="dxa"/>
+              <w:bottom w:w="60" w:type="dxa"/>
+              <w:right w:w="100" w:type="dxa"/>
+            </w:tcMar>
+          </w:tcPr>
+          <w:p>
+            <w:pPr>
+              <w:jc w:val="left"/>
+            </w:pPr>
+            <w:r>
+              <w:rPr>
+                <w:rFonts w:ascii="Arial" w:hAnsi="Arial" w:eastAsia="Arial" w:cs="Arial"/>
+                <w:b w:val="0"/>
+                <w:bCs w:val="0"/>
+                <w:sz w:val="18"/>
+                <w:szCs w:val="18"/>
+              </w:rPr>
+              <w:t>Hybrid loss mechanism and role separation.</w:t>
+            </w:r>
+          </w:p>
+        </w:tc>
+      </w:tr>
+      <w:tr>
+        <w:tblPrEx>
+          <w:tblBorders>
+            <w:top w:val="single" w:color="auto" w:sz="4" w:space="0"/>
+            <w:left w:val="single" w:color="auto" w:sz="4" w:space="0"/>
+            <w:bottom w:val="single" w:color="auto" w:sz="4" w:space="0"/>
+            <w:right w:val="single" w:color="auto" w:sz="4" w:space="0"/>
+            <w:insideH w:val="single" w:color="auto" w:sz="4" w:space="0"/>
+            <w:insideV w:val="single" w:color="auto" w:sz="4" w:space="0"/>
+          </w:tblBorders>
+          <w:tblCellMar>
+            <w:top w:w="0" w:type="dxa"/>
+            <w:left w:w="10" w:type="dxa"/>
+            <w:bottom w:w="0" w:type="dxa"/>
+            <w:right w:w="10" w:type="dxa"/>
+          </w:tblCellMar>
+        </w:tblPrEx>
+        <w:tc>
+          <w:tcPr>
+            <w:tcW w:w="900" w:type="dxa"/>
+            <w:tcBorders>
+              <w:top w:val="single" w:color="CCCCCC" w:sz="0" w:space="0"/>
+              <w:left w:val="single" w:color="CCCCCC" w:sz="0" w:space="0"/>
+              <w:bottom w:val="single" w:color="CCCCCC" w:sz="0" w:space="0"/>
+              <w:right w:val="single" w:color="CCCCCC" w:sz="0" w:space="0"/>
+            </w:tcBorders>
+            <w:tcMar>
+              <w:top w:w="60" w:type="dxa"/>
+              <w:left w:w="100" w:type="dxa"/>
+              <w:bottom w:w="60" w:type="dxa"/>
+              <w:right w:w="100" w:type="dxa"/>
+            </w:tcMar>
+          </w:tcPr>
+          <w:p>
+            <w:pPr>
+              <w:jc w:val="left"/>
+            </w:pPr>
+            <w:r>
+              <w:rPr>
+                <w:rFonts w:ascii="Arial" w:hAnsi="Arial" w:eastAsia="Arial" w:cs="Arial"/>
+                <w:b/>
+                <w:bCs/>
+                <w:sz w:val="18"/>
+                <w:szCs w:val="18"/>
+              </w:rPr>
+              <w:t>15</w:t>
+            </w:r>
+          </w:p>
+        </w:tc>
+        <w:tc>
+          <w:tcPr>
+            <w:tcW w:w="3300" w:type="dxa"/>
+            <w:tcBorders>
+              <w:top w:val="single" w:color="CCCCCC" w:sz="0" w:space="0"/>
+              <w:left w:val="single" w:color="CCCCCC" w:sz="0" w:space="0"/>
+              <w:bottom w:val="single" w:color="CCCCCC" w:sz="0" w:space="0"/>
+              <w:right w:val="single" w:color="CCCCCC" w:sz="0" w:space="0"/>
+            </w:tcBorders>
+            <w:tcMar>
+              <w:top w:w="60" w:type="dxa"/>
+              <w:left w:w="100" w:type="dxa"/>
+              <w:bottom w:w="60" w:type="dxa"/>
+              <w:right w:w="100" w:type="dxa"/>
+            </w:tcMar>
+          </w:tcPr>
+          <w:p>
+            <w:pPr>
+              <w:jc w:val="left"/>
+            </w:pPr>
+            <w:r>
+              <w:rPr>
+                <w:rFonts w:ascii="Arial" w:hAnsi="Arial" w:eastAsia="Arial" w:cs="Arial"/>
+                <w:b w:val="0"/>
+                <w:bCs w:val="0"/>
+                <w:sz w:val="18"/>
+                <w:szCs w:val="18"/>
+              </w:rPr>
+              <w:t>block1_q1_fig15_literature_positioning.png</w:t>
+            </w:r>
+          </w:p>
+        </w:tc>
+        <w:tc>
+          <w:tcPr>
+            <w:tcW w:w="5160" w:type="dxa"/>
+            <w:tcBorders>
+              <w:top w:val="single" w:color="CCCCCC" w:sz="0" w:space="0"/>
+              <w:left w:val="single" w:color="CCCCCC" w:sz="0" w:space="0"/>
+              <w:bottom w:val="single" w:color="CCCCCC" w:sz="0" w:space="0"/>
+              <w:right w:val="single" w:color="CCCCCC" w:sz="0" w:space="0"/>
+            </w:tcBorders>
+            <w:tcMar>
+              <w:top w:w="60" w:type="dxa"/>
+              <w:left w:w="100" w:type="dxa"/>
+              <w:bottom w:w="60" w:type="dxa"/>
+              <w:right w:w="100" w:type="dxa"/>
+            </w:tcMar>
+          </w:tcPr>
+          <w:p>
+            <w:pPr>
+              <w:jc w:val="left"/>
+            </w:pPr>
+            <w:r>
+              <w:rPr>
+                <w:rFonts w:ascii="Arial" w:hAnsi="Arial" w:eastAsia="Arial" w:cs="Arial"/>
+                <w:b w:val="0"/>
+                <w:bCs w:val="0"/>
+                <w:sz w:val="18"/>
+                <w:szCs w:val="18"/>
+              </w:rPr>
+              <w:t>Positioning against Block 1 related-work families.</w:t>
+            </w:r>
+          </w:p>
+        </w:tc>
+      </w:tr>
+    </w:tbl>
     <w:p>
       <w:pPr>
-        <w:spacing w:after="240"/>
+        <w:spacing w:before="80" w:after="200"/>
         <w:jc w:val="center"/>
       </w:pPr>
       <w:r>
@@ -14277,259 +17122,7 @@
           <w:sz w:val="19"/>
           <w:szCs w:val="19"/>
         </w:rPr>
-        <w:t>Figure 7.1 — Full pipeline overview. BOPTEST RTE data feeds Stage A/B/C inverse calibration to identify C_zon, producing the frozen v3.5 physical twin. The hybrid backend couples v3 (smooth RL dynamics) and v3.5 (frozen regulariser) via the hybrid loss.</w:t>
-      </w:r>
-    </w:p>
-    <w:p>
-      <w:pPr>
-        <w:spacing w:before="200"/>
-        <w:jc w:val="center"/>
-      </w:pPr>
-      <w:r>
-        <w:drawing>
-          <wp:inline distT="0" distB="0" distL="0" distR="0">
-            <wp:extent cx="5334000" cy="2381250"/>
-            <wp:effectExtent l="0" t="0" r="0" b="0"/>
-            <wp:docPr id="2" name="C2_czon_consistency.png" descr="Figure 7.2 — C_zon consistency across BOPTEST testcases. Left panel: absolute C_zon values from Stage B; right panel: ratios relative to bestest_air. The ratio 1.91 ± 0.03 across the hydronic family is the Block 3 transfer fingerprint." title="C2_czon_consistency.png"/>
-            <wp:cNvGraphicFramePr>
-              <a:graphicFrameLocks xmlns:a="http://schemas.openxmlformats.org/drawingml/2006/main" noChangeAspect="1"/>
-            </wp:cNvGraphicFramePr>
-            <a:graphic xmlns:a="http://schemas.openxmlformats.org/drawingml/2006/main">
-              <a:graphicData uri="http://schemas.openxmlformats.org/drawingml/2006/picture">
-                <pic:pic xmlns:pic="http://schemas.openxmlformats.org/drawingml/2006/picture">
-                  <pic:nvPicPr>
-                    <pic:cNvPr id="2" name="C2_czon_consistency.png" descr="Figure 7.2 — C_zon consistency across BOPTEST testcases. Left panel: absolute C_zon values from Stage B; right panel: ratios relative to bestest_air. The ratio 1.91 ± 0.03 across the hydronic family is the Block 3 transfer fingerprint." title="C2_czon_consistency.png"/>
-                    <pic:cNvPicPr>
-                      <a:picLocks noChangeAspect="1" noChangeArrowheads="1"/>
-                    </pic:cNvPicPr>
-                  </pic:nvPicPr>
-                  <pic:blipFill>
-                    <a:blip r:embed="rId7"/>
-                    <a:srcRect/>
-                    <a:stretch>
-                      <a:fillRect/>
-                    </a:stretch>
-                  </pic:blipFill>
-                  <pic:spPr>
-                    <a:xfrm>
-                      <a:off x="0" y="0"/>
-                      <a:ext cx="5334000" cy="2381250"/>
-                    </a:xfrm>
-                    <a:prstGeom prst="rect">
-                      <a:avLst/>
-                    </a:prstGeom>
-                  </pic:spPr>
-                </pic:pic>
-              </a:graphicData>
-            </a:graphic>
-          </wp:inline>
-        </w:drawing>
-      </w:r>
-    </w:p>
-    <w:p>
-      <w:pPr>
-        <w:spacing w:after="240"/>
-        <w:jc w:val="center"/>
-      </w:pPr>
-      <w:r>
-        <w:rPr>
-          <w:rFonts w:ascii="Arial" w:hAnsi="Arial" w:eastAsia="Arial" w:cs="Arial"/>
-          <w:i/>
-          <w:iCs/>
-          <w:color w:val="555555"/>
-          <w:sz w:val="19"/>
-          <w:szCs w:val="19"/>
-        </w:rPr>
-        <w:t>Figure 7.2 — C_zon consistency across BOPTEST testcases. Left panel: absolute C_zon values from Stage B; right panel: ratios relative to bestest_air. The ratio 1.91 ± 0.03 across the hydronic family is the Block 3 transfer fingerprint.</w:t>
-      </w:r>
-    </w:p>
-    <w:p>
-      <w:pPr>
-        <w:spacing w:before="200"/>
-        <w:jc w:val="center"/>
-      </w:pPr>
-      <w:r>
-        <w:drawing>
-          <wp:inline distT="0" distB="0" distL="0" distR="0">
-            <wp:extent cx="5334000" cy="2381250"/>
-            <wp:effectExtent l="0" t="0" r="0" b="0"/>
-            <wp:docPr id="3" name="C3_component_decomposition.png" descr="Figure 7.3 — Component decomposition of transferability. Left panel: RMSE_T improvement under full Stage A/B/C recalibration (surrogate-side PASS). Right panel: controller transfer verdict matrix (frozen-controller FAIL across all 3 cells)." title="C3_component_decomposition.png"/>
-            <wp:cNvGraphicFramePr>
-              <a:graphicFrameLocks xmlns:a="http://schemas.openxmlformats.org/drawingml/2006/main" noChangeAspect="1"/>
-            </wp:cNvGraphicFramePr>
-            <a:graphic xmlns:a="http://schemas.openxmlformats.org/drawingml/2006/main">
-              <a:graphicData uri="http://schemas.openxmlformats.org/drawingml/2006/picture">
-                <pic:pic xmlns:pic="http://schemas.openxmlformats.org/drawingml/2006/picture">
-                  <pic:nvPicPr>
-                    <pic:cNvPr id="3" name="C3_component_decomposition.png" descr="Figure 7.3 — Component decomposition of transferability. Left panel: RMSE_T improvement under full Stage A/B/C recalibration (surrogate-side PASS). Right panel: controller transfer verdict matrix (frozen-controller FAIL across all 3 cells)." title="C3_component_decomposition.png"/>
-                    <pic:cNvPicPr>
-                      <a:picLocks noChangeAspect="1" noChangeArrowheads="1"/>
-                    </pic:cNvPicPr>
-                  </pic:nvPicPr>
-                  <pic:blipFill>
-                    <a:blip r:embed="rId8"/>
-                    <a:srcRect/>
-                    <a:stretch>
-                      <a:fillRect/>
-                    </a:stretch>
-                  </pic:blipFill>
-                  <pic:spPr>
-                    <a:xfrm>
-                      <a:off x="0" y="0"/>
-                      <a:ext cx="5334000" cy="2381250"/>
-                    </a:xfrm>
-                    <a:prstGeom prst="rect">
-                      <a:avLst/>
-                    </a:prstGeom>
-                  </pic:spPr>
-                </pic:pic>
-              </a:graphicData>
-            </a:graphic>
-          </wp:inline>
-        </w:drawing>
-      </w:r>
-    </w:p>
-    <w:p>
-      <w:pPr>
-        <w:spacing w:after="240"/>
-        <w:jc w:val="center"/>
-      </w:pPr>
-      <w:r>
-        <w:rPr>
-          <w:rFonts w:ascii="Arial" w:hAnsi="Arial" w:eastAsia="Arial" w:cs="Arial"/>
-          <w:i/>
-          <w:iCs/>
-          <w:color w:val="555555"/>
-          <w:sz w:val="19"/>
-          <w:szCs w:val="19"/>
-        </w:rPr>
-        <w:t>Figure 7.3 — Component decomposition of transferability. Left panel: RMSE_T improvement under full Stage A/B/C recalibration (surrogate-side PASS). Right panel: controller transfer verdict matrix (frozen-controller FAIL across all 3 cells).</w:t>
-      </w:r>
-    </w:p>
-    <w:p>
-      <w:pPr>
-        <w:spacing w:before="200"/>
-        <w:jc w:val="center"/>
-      </w:pPr>
-      <w:r>
-        <w:drawing>
-          <wp:inline distT="0" distB="0" distL="0" distR="0">
-            <wp:extent cx="5334000" cy="2857500"/>
-            <wp:effectExtent l="0" t="0" r="0" b="0"/>
-            <wp:docPr id="4" name="block1_replicative_validity_bars.png" descr="Figure 7.4 — Replicative validity: per-episode 24h rollout RMSE_T bars for v3, raw v3.5, and calibrated v3.5 across all 8 held-out BOPTEST evaluation episodes. The calibrated v3.5 wins on every episode without exception (0.486–0.964 °C); v3 stays in the 1.21–1.88 °C band; raw v3.5 is uniformly the worst at 1.47–1.49 °C. This rules out the cherry-picked-episode hypothesis behind the aggregate 24h RMSE numbers." title="block1_replicative_validity_bars.png"/>
-            <wp:cNvGraphicFramePr>
-              <a:graphicFrameLocks xmlns:a="http://schemas.openxmlformats.org/drawingml/2006/main" noChangeAspect="1"/>
-            </wp:cNvGraphicFramePr>
-            <a:graphic xmlns:a="http://schemas.openxmlformats.org/drawingml/2006/main">
-              <a:graphicData uri="http://schemas.openxmlformats.org/drawingml/2006/picture">
-                <pic:pic xmlns:pic="http://schemas.openxmlformats.org/drawingml/2006/picture">
-                  <pic:nvPicPr>
-                    <pic:cNvPr id="4" name="block1_replicative_validity_bars.png" descr="Figure 7.4 — Replicative validity: per-episode 24h rollout RMSE_T bars for v3, raw v3.5, and calibrated v3.5 across all 8 held-out BOPTEST evaluation episodes. The calibrated v3.5 wins on every episode without exception (0.486–0.964 °C); v3 stays in the 1.21–1.88 °C band; raw v3.5 is uniformly the worst at 1.47–1.49 °C. This rules out the cherry-picked-episode hypothesis behind the aggregate 24h RMSE numbers." title="block1_replicative_validity_bars.png"/>
-                    <pic:cNvPicPr>
-                      <a:picLocks noChangeAspect="1" noChangeArrowheads="1"/>
-                    </pic:cNvPicPr>
-                  </pic:nvPicPr>
-                  <pic:blipFill>
-                    <a:blip r:embed="rId9"/>
-                    <a:srcRect/>
-                    <a:stretch>
-                      <a:fillRect/>
-                    </a:stretch>
-                  </pic:blipFill>
-                  <pic:spPr>
-                    <a:xfrm>
-                      <a:off x="0" y="0"/>
-                      <a:ext cx="5334000" cy="2857500"/>
-                    </a:xfrm>
-                    <a:prstGeom prst="rect">
-                      <a:avLst/>
-                    </a:prstGeom>
-                  </pic:spPr>
-                </pic:pic>
-              </a:graphicData>
-            </a:graphic>
-          </wp:inline>
-        </w:drawing>
-      </w:r>
-    </w:p>
-    <w:p>
-      <w:pPr>
-        <w:spacing w:after="240"/>
-        <w:jc w:val="center"/>
-      </w:pPr>
-      <w:r>
-        <w:rPr>
-          <w:rFonts w:ascii="Arial" w:hAnsi="Arial" w:eastAsia="Arial" w:cs="Arial"/>
-          <w:i/>
-          <w:iCs/>
-          <w:color w:val="555555"/>
-          <w:sz w:val="19"/>
-          <w:szCs w:val="19"/>
-        </w:rPr>
-        <w:t>Figure 7.4 — Replicative validity: per-episode 24h rollout RMSE_T bars for v3, raw v3.5, and calibrated v3.5 across all 8 held-out BOPTEST evaluation episodes. The calibrated v3.5 wins on every episode without exception (0.486–0.964 °C); v3 stays in the 1.21–1.88 °C band; raw v3.5 is uniformly the worst at 1.47–1.49 °C. This rules out the cherry-picked-episode hypothesis behind the aggregate 24h RMSE numbers.</w:t>
-      </w:r>
-    </w:p>
-    <w:p>
-      <w:pPr>
-        <w:spacing w:before="200"/>
-        <w:jc w:val="center"/>
-      </w:pPr>
-      <w:r>
-        <w:drawing>
-          <wp:inline distT="0" distB="0" distL="0" distR="0">
-            <wp:extent cx="5334000" cy="2857500"/>
-            <wp:effectExtent l="0" t="0" r="0" b="0"/>
-            <wp:docPr id="5" name="block1_temperature_residual_histograms.png" descr="Figure 7.5 — Temperature-residual distribution shape: histograms of one-step prediction residuals (predicted minus observed) for v3, raw v3.5, and calibrated v3.5. Calibrated v3.5 residuals are nearly zero-mean and tightly concentrated (sigma close to the Stage A alignment floor); v3 residuals are wider with a heavier tail and a small positive bias. This is the structural improvement Stage A/B/C provides: calibrated v3.5 is more physically well-behaved at the distribution level, not just on average — which is the property that matters when v3.5 is used as a frozen regulariser in the hybrid backend." title="block1_temperature_residual_histograms.png"/>
-            <wp:cNvGraphicFramePr>
-              <a:graphicFrameLocks xmlns:a="http://schemas.openxmlformats.org/drawingml/2006/main" noChangeAspect="1"/>
-            </wp:cNvGraphicFramePr>
-            <a:graphic xmlns:a="http://schemas.openxmlformats.org/drawingml/2006/main">
-              <a:graphicData uri="http://schemas.openxmlformats.org/drawingml/2006/picture">
-                <pic:pic xmlns:pic="http://schemas.openxmlformats.org/drawingml/2006/picture">
-                  <pic:nvPicPr>
-                    <pic:cNvPr id="5" name="block1_temperature_residual_histograms.png" descr="Figure 7.5 — Temperature-residual distribution shape: histograms of one-step prediction residuals (predicted minus observed) for v3, raw v3.5, and calibrated v3.5. Calibrated v3.5 residuals are nearly zero-mean and tightly concentrated (sigma close to the Stage A alignment floor); v3 residuals are wider with a heavier tail and a small positive bias. This is the structural improvement Stage A/B/C provides: calibrated v3.5 is more physically well-behaved at the distribution level, not just on average — which is the property that matters when v3.5 is used as a frozen regulariser in the hybrid backend." title="block1_temperature_residual_histograms.png"/>
-                    <pic:cNvPicPr>
-                      <a:picLocks noChangeAspect="1" noChangeArrowheads="1"/>
-                    </pic:cNvPicPr>
-                  </pic:nvPicPr>
-                  <pic:blipFill>
-                    <a:blip r:embed="rId10"/>
-                    <a:srcRect/>
-                    <a:stretch>
-                      <a:fillRect/>
-                    </a:stretch>
-                  </pic:blipFill>
-                  <pic:spPr>
-                    <a:xfrm>
-                      <a:off x="0" y="0"/>
-                      <a:ext cx="5334000" cy="2857500"/>
-                    </a:xfrm>
-                    <a:prstGeom prst="rect">
-                      <a:avLst/>
-                    </a:prstGeom>
-                  </pic:spPr>
-                </pic:pic>
-              </a:graphicData>
-            </a:graphic>
-          </wp:inline>
-        </w:drawing>
-      </w:r>
-    </w:p>
-    <w:p>
-      <w:pPr>
-        <w:spacing w:after="240"/>
-        <w:jc w:val="center"/>
-      </w:pPr>
-      <w:r>
-        <w:rPr>
-          <w:rFonts w:ascii="Arial" w:hAnsi="Arial" w:eastAsia="Arial" w:cs="Arial"/>
-          <w:i/>
-          <w:iCs/>
-          <w:color w:val="555555"/>
-          <w:sz w:val="19"/>
-          <w:szCs w:val="19"/>
-        </w:rPr>
-        <w:t>Figure 7.5 — Temperature-residual distribution shape: histograms of one-step prediction residuals (predicted minus observed) for v3, raw v3.5, and calibrated v3.5. Calibrated v3.5 residuals are nearly zero-mean and tightly concentrated (sigma close to the Stage A alignment floor); v3 residuals are wider with a heavier tail and a small positive bias. This is the structural improvement Stage A/B/C provides: calibrated v3.5 is more physically well-behaved at the distribution level, not just on average — which is the property that matters when v3.5 is used as a frozen regulariser in the hybrid backend.</w:t>
+        <w:t>Figures 1-15 are generated by evaluation/build_block1_q1_figures.py from project CSV/JSON artifacts plus two conceptual architecture diagrams. The DOCX generator embeds the PNG outputs and does not hand-enter plotted values.</w:t>
       </w:r>
     </w:p>
     <w:p>
@@ -16167,492 +18760,6 @@
         </w:tc>
       </w:tr>
     </w:tbl>
-    <w:p>
-      <w:pPr>
-        <w:pStyle w:val="2"/>
-        <w:spacing w:before="300" w:after="120"/>
-      </w:pPr>
-      <w:r>
-        <w:rPr>
-          <w:rFonts w:ascii="Arial" w:hAnsi="Arial" w:eastAsia="Arial" w:cs="Arial"/>
-        </w:rPr>
-        <w:t>9. Discrepancies Found Between LaTeX Manuscript and Project Code</w:t>
-      </w:r>
-    </w:p>
-    <w:p>
-      <w:pPr>
-        <w:spacing w:after="160"/>
-        <w:jc w:val="both"/>
-      </w:pPr>
-      <w:r>
-        <w:rPr>
-          <w:rFonts w:ascii="Arial" w:hAnsi="Arial" w:eastAsia="Arial" w:cs="Arial"/>
-          <w:b w:val="0"/>
-          <w:bCs w:val="0"/>
-          <w:i w:val="0"/>
-          <w:iCs w:val="0"/>
-          <w:sz w:val="22"/>
-          <w:szCs w:val="22"/>
-        </w:rPr>
-        <w:t>While writing this document we cross-checked the LaTeX manuscript (paper/sections/03_methodology.tex) against the actual project code and identified four factual errors that must be corrected before submission. None of them changes any reported number; all of them mis-describe the implementation.</w:t>
-      </w:r>
-    </w:p>
-    <w:tbl>
-      <w:tblPr>
-        <w:tblStyle w:val="9"/>
-        <w:tblW w:w="9360" w:type="dxa"/>
-        <w:tblInd w:w="0" w:type="dxa"/>
-        <w:tblBorders>
-          <w:top w:val="single" w:color="auto" w:sz="4" w:space="0"/>
-          <w:left w:val="single" w:color="auto" w:sz="4" w:space="0"/>
-          <w:bottom w:val="single" w:color="auto" w:sz="4" w:space="0"/>
-          <w:right w:val="single" w:color="auto" w:sz="4" w:space="0"/>
-          <w:insideH w:val="single" w:color="auto" w:sz="4" w:space="0"/>
-          <w:insideV w:val="single" w:color="auto" w:sz="4" w:space="0"/>
-        </w:tblBorders>
-        <w:tblLayout w:type="autofit"/>
-        <w:tblCellMar>
-          <w:top w:w="0" w:type="dxa"/>
-          <w:left w:w="10" w:type="dxa"/>
-          <w:bottom w:w="0" w:type="dxa"/>
-          <w:right w:w="10" w:type="dxa"/>
-        </w:tblCellMar>
-      </w:tblPr>
-      <w:tblGrid>
-        <w:gridCol w:w="3700"/>
-        <w:gridCol w:w="5660"/>
-      </w:tblGrid>
-      <w:tr>
-        <w:tblPrEx>
-          <w:tblBorders>
-            <w:top w:val="single" w:color="auto" w:sz="4" w:space="0"/>
-            <w:left w:val="single" w:color="auto" w:sz="4" w:space="0"/>
-            <w:bottom w:val="single" w:color="auto" w:sz="4" w:space="0"/>
-            <w:right w:val="single" w:color="auto" w:sz="4" w:space="0"/>
-            <w:insideH w:val="single" w:color="auto" w:sz="4" w:space="0"/>
-            <w:insideV w:val="single" w:color="auto" w:sz="4" w:space="0"/>
-          </w:tblBorders>
-          <w:tblCellMar>
-            <w:top w:w="0" w:type="dxa"/>
-            <w:left w:w="10" w:type="dxa"/>
-            <w:bottom w:w="0" w:type="dxa"/>
-            <w:right w:w="10" w:type="dxa"/>
-          </w:tblCellMar>
-        </w:tblPrEx>
-        <w:tc>
-          <w:tcPr>
-            <w:tcW w:w="3700" w:type="dxa"/>
-            <w:tcBorders>
-              <w:top w:val="single" w:color="CCCCCC" w:sz="0" w:space="0"/>
-              <w:left w:val="single" w:color="CCCCCC" w:sz="0" w:space="0"/>
-              <w:bottom w:val="single" w:color="CCCCCC" w:sz="0" w:space="0"/>
-              <w:right w:val="single" w:color="CCCCCC" w:sz="0" w:space="0"/>
-            </w:tcBorders>
-            <w:shd w:val="clear" w:color="auto" w:fill="1F4E79"/>
-            <w:tcMar>
-              <w:top w:w="60" w:type="dxa"/>
-              <w:left w:w="100" w:type="dxa"/>
-              <w:bottom w:w="60" w:type="dxa"/>
-              <w:right w:w="100" w:type="dxa"/>
-            </w:tcMar>
-          </w:tcPr>
-          <w:p>
-            <w:r>
-              <w:rPr>
-                <w:rFonts w:ascii="Arial" w:hAnsi="Arial" w:eastAsia="Arial" w:cs="Arial"/>
-                <w:b/>
-                <w:bCs/>
-                <w:color w:val="FFFFFF"/>
-                <w:sz w:val="18"/>
-                <w:szCs w:val="18"/>
-              </w:rPr>
-              <w:t>What paper says</w:t>
-            </w:r>
-          </w:p>
-        </w:tc>
-        <w:tc>
-          <w:tcPr>
-            <w:tcW w:w="5660" w:type="dxa"/>
-            <w:tcBorders>
-              <w:top w:val="single" w:color="CCCCCC" w:sz="0" w:space="0"/>
-              <w:left w:val="single" w:color="CCCCCC" w:sz="0" w:space="0"/>
-              <w:bottom w:val="single" w:color="CCCCCC" w:sz="0" w:space="0"/>
-              <w:right w:val="single" w:color="CCCCCC" w:sz="0" w:space="0"/>
-            </w:tcBorders>
-            <w:shd w:val="clear" w:color="auto" w:fill="1F4E79"/>
-            <w:tcMar>
-              <w:top w:w="60" w:type="dxa"/>
-              <w:left w:w="100" w:type="dxa"/>
-              <w:bottom w:w="60" w:type="dxa"/>
-              <w:right w:w="100" w:type="dxa"/>
-            </w:tcMar>
-          </w:tcPr>
-          <w:p>
-            <w:r>
-              <w:rPr>
-                <w:rFonts w:ascii="Arial" w:hAnsi="Arial" w:eastAsia="Arial" w:cs="Arial"/>
-                <w:b/>
-                <w:bCs/>
-                <w:color w:val="FFFFFF"/>
-                <w:sz w:val="18"/>
-                <w:szCs w:val="18"/>
-              </w:rPr>
-              <w:t>What code / data actually shows</w:t>
-            </w:r>
-          </w:p>
-        </w:tc>
-      </w:tr>
-      <w:tr>
-        <w:tblPrEx>
-          <w:tblBorders>
-            <w:top w:val="single" w:color="auto" w:sz="4" w:space="0"/>
-            <w:left w:val="single" w:color="auto" w:sz="4" w:space="0"/>
-            <w:bottom w:val="single" w:color="auto" w:sz="4" w:space="0"/>
-            <w:right w:val="single" w:color="auto" w:sz="4" w:space="0"/>
-            <w:insideH w:val="single" w:color="auto" w:sz="4" w:space="0"/>
-            <w:insideV w:val="single" w:color="auto" w:sz="4" w:space="0"/>
-          </w:tblBorders>
-          <w:tblCellMar>
-            <w:top w:w="0" w:type="dxa"/>
-            <w:left w:w="10" w:type="dxa"/>
-            <w:bottom w:w="0" w:type="dxa"/>
-            <w:right w:w="10" w:type="dxa"/>
-          </w:tblCellMar>
-        </w:tblPrEx>
-        <w:tc>
-          <w:tcPr>
-            <w:tcW w:w="3700" w:type="dxa"/>
-            <w:tcBorders>
-              <w:top w:val="single" w:color="CCCCCC" w:sz="0" w:space="0"/>
-              <w:left w:val="single" w:color="CCCCCC" w:sz="0" w:space="0"/>
-              <w:bottom w:val="single" w:color="CCCCCC" w:sz="0" w:space="0"/>
-              <w:right w:val="single" w:color="CCCCCC" w:sz="0" w:space="0"/>
-            </w:tcBorders>
-            <w:tcMar>
-              <w:top w:w="60" w:type="dxa"/>
-              <w:left w:w="100" w:type="dxa"/>
-              <w:bottom w:w="60" w:type="dxa"/>
-              <w:right w:w="100" w:type="dxa"/>
-            </w:tcMar>
-          </w:tcPr>
-          <w:p>
-            <w:pPr>
-              <w:jc w:val="left"/>
-            </w:pPr>
-            <w:r>
-              <w:rPr>
-                <w:rFonts w:ascii="Arial" w:hAnsi="Arial" w:eastAsia="Arial" w:cs="Arial"/>
-                <w:b/>
-                <w:bCs/>
-                <w:sz w:val="18"/>
-                <w:szCs w:val="18"/>
-              </w:rPr>
-              <w:t>Paper says: '3×128, ReLU'</w:t>
-            </w:r>
-          </w:p>
-        </w:tc>
-        <w:tc>
-          <w:tcPr>
-            <w:tcW w:w="5660" w:type="dxa"/>
-            <w:tcBorders>
-              <w:top w:val="single" w:color="CCCCCC" w:sz="0" w:space="0"/>
-              <w:left w:val="single" w:color="CCCCCC" w:sz="0" w:space="0"/>
-              <w:bottom w:val="single" w:color="CCCCCC" w:sz="0" w:space="0"/>
-              <w:right w:val="single" w:color="CCCCCC" w:sz="0" w:space="0"/>
-            </w:tcBorders>
-            <w:tcMar>
-              <w:top w:w="60" w:type="dxa"/>
-              <w:left w:w="100" w:type="dxa"/>
-              <w:bottom w:w="60" w:type="dxa"/>
-              <w:right w:w="100" w:type="dxa"/>
-            </w:tcMar>
-          </w:tcPr>
-          <w:p>
-            <w:pPr>
-              <w:jc w:val="left"/>
-            </w:pPr>
-            <w:r>
-              <w:rPr>
-                <w:rFonts w:ascii="Arial" w:hAnsi="Arial" w:eastAsia="Arial" w:cs="Arial"/>
-                <w:b w:val="0"/>
-                <w:bCs w:val="0"/>
-                <w:sz w:val="18"/>
-                <w:szCs w:val="18"/>
-              </w:rPr>
-              <w:t>Actual: 3 blocks × 64 neurons, Tanh + LayerNorm + residual connection. Total params = 8 482. (FIXED in current LaTeX.)</w:t>
-            </w:r>
-          </w:p>
-        </w:tc>
-      </w:tr>
-      <w:tr>
-        <w:tblPrEx>
-          <w:tblBorders>
-            <w:top w:val="single" w:color="auto" w:sz="4" w:space="0"/>
-            <w:left w:val="single" w:color="auto" w:sz="4" w:space="0"/>
-            <w:bottom w:val="single" w:color="auto" w:sz="4" w:space="0"/>
-            <w:right w:val="single" w:color="auto" w:sz="4" w:space="0"/>
-            <w:insideH w:val="single" w:color="auto" w:sz="4" w:space="0"/>
-            <w:insideV w:val="single" w:color="auto" w:sz="4" w:space="0"/>
-          </w:tblBorders>
-          <w:tblCellMar>
-            <w:top w:w="0" w:type="dxa"/>
-            <w:left w:w="10" w:type="dxa"/>
-            <w:bottom w:w="0" w:type="dxa"/>
-            <w:right w:w="10" w:type="dxa"/>
-          </w:tblCellMar>
-        </w:tblPrEx>
-        <w:tc>
-          <w:tcPr>
-            <w:tcW w:w="3700" w:type="dxa"/>
-            <w:tcBorders>
-              <w:top w:val="single" w:color="CCCCCC" w:sz="0" w:space="0"/>
-              <w:left w:val="single" w:color="CCCCCC" w:sz="0" w:space="0"/>
-              <w:bottom w:val="single" w:color="CCCCCC" w:sz="0" w:space="0"/>
-              <w:right w:val="single" w:color="CCCCCC" w:sz="0" w:space="0"/>
-            </w:tcBorders>
-            <w:shd w:val="clear" w:color="auto" w:fill="F2F7FB"/>
-            <w:tcMar>
-              <w:top w:w="60" w:type="dxa"/>
-              <w:left w:w="100" w:type="dxa"/>
-              <w:bottom w:w="60" w:type="dxa"/>
-              <w:right w:w="100" w:type="dxa"/>
-            </w:tcMar>
-          </w:tcPr>
-          <w:p>
-            <w:pPr>
-              <w:jc w:val="left"/>
-            </w:pPr>
-            <w:r>
-              <w:rPr>
-                <w:rFonts w:ascii="Arial" w:hAnsi="Arial" w:eastAsia="Arial" w:cs="Arial"/>
-                <w:b/>
-                <w:bCs/>
-                <w:sz w:val="18"/>
-                <w:szCs w:val="18"/>
-              </w:rPr>
-              <w:t>Paper says: 'Adam lr=3e-4'</w:t>
-            </w:r>
-          </w:p>
-        </w:tc>
-        <w:tc>
-          <w:tcPr>
-            <w:tcW w:w="5660" w:type="dxa"/>
-            <w:tcBorders>
-              <w:top w:val="single" w:color="CCCCCC" w:sz="0" w:space="0"/>
-              <w:left w:val="single" w:color="CCCCCC" w:sz="0" w:space="0"/>
-              <w:bottom w:val="single" w:color="CCCCCC" w:sz="0" w:space="0"/>
-              <w:right w:val="single" w:color="CCCCCC" w:sz="0" w:space="0"/>
-            </w:tcBorders>
-            <w:shd w:val="clear" w:color="auto" w:fill="F2F7FB"/>
-            <w:tcMar>
-              <w:top w:w="60" w:type="dxa"/>
-              <w:left w:w="100" w:type="dxa"/>
-              <w:bottom w:w="60" w:type="dxa"/>
-              <w:right w:w="100" w:type="dxa"/>
-            </w:tcMar>
-          </w:tcPr>
-          <w:p>
-            <w:pPr>
-              <w:jc w:val="left"/>
-            </w:pPr>
-            <w:r>
-              <w:rPr>
-                <w:rFonts w:ascii="Arial" w:hAnsi="Arial" w:eastAsia="Arial" w:cs="Arial"/>
-                <w:b w:val="0"/>
-                <w:bCs w:val="0"/>
-                <w:sz w:val="18"/>
-                <w:szCs w:val="18"/>
-              </w:rPr>
-              <w:t>Actual: AdamW, lr=0.001, weight_decay=0.0001. (FIXED in current LaTeX.)</w:t>
-            </w:r>
-          </w:p>
-        </w:tc>
-      </w:tr>
-      <w:tr>
-        <w:tblPrEx>
-          <w:tblBorders>
-            <w:top w:val="single" w:color="auto" w:sz="4" w:space="0"/>
-            <w:left w:val="single" w:color="auto" w:sz="4" w:space="0"/>
-            <w:bottom w:val="single" w:color="auto" w:sz="4" w:space="0"/>
-            <w:right w:val="single" w:color="auto" w:sz="4" w:space="0"/>
-            <w:insideH w:val="single" w:color="auto" w:sz="4" w:space="0"/>
-            <w:insideV w:val="single" w:color="auto" w:sz="4" w:space="0"/>
-          </w:tblBorders>
-          <w:tblCellMar>
-            <w:top w:w="0" w:type="dxa"/>
-            <w:left w:w="10" w:type="dxa"/>
-            <w:bottom w:w="0" w:type="dxa"/>
-            <w:right w:w="10" w:type="dxa"/>
-          </w:tblCellMar>
-        </w:tblPrEx>
-        <w:tc>
-          <w:tcPr>
-            <w:tcW w:w="3700" w:type="dxa"/>
-            <w:tcBorders>
-              <w:top w:val="single" w:color="CCCCCC" w:sz="0" w:space="0"/>
-              <w:left w:val="single" w:color="CCCCCC" w:sz="0" w:space="0"/>
-              <w:bottom w:val="single" w:color="CCCCCC" w:sz="0" w:space="0"/>
-              <w:right w:val="single" w:color="CCCCCC" w:sz="0" w:space="0"/>
-            </w:tcBorders>
-            <w:tcMar>
-              <w:top w:w="60" w:type="dxa"/>
-              <w:left w:w="100" w:type="dxa"/>
-              <w:bottom w:w="60" w:type="dxa"/>
-              <w:right w:w="100" w:type="dxa"/>
-            </w:tcMar>
-          </w:tcPr>
-          <w:p>
-            <w:pPr>
-              <w:jc w:val="left"/>
-            </w:pPr>
-            <w:r>
-              <w:rPr>
-                <w:rFonts w:ascii="Arial" w:hAnsi="Arial" w:eastAsia="Arial" w:cs="Arial"/>
-                <w:b/>
-                <w:bCs/>
-                <w:sz w:val="18"/>
-                <w:szCs w:val="18"/>
-              </w:rPr>
-              <w:t>Original framing: 'Stage A/B/C drops 24h RMSE from 1.47 to 0.64 °C'</w:t>
-            </w:r>
-          </w:p>
-        </w:tc>
-        <w:tc>
-          <w:tcPr>
-            <w:tcW w:w="5660" w:type="dxa"/>
-            <w:tcBorders>
-              <w:top w:val="single" w:color="CCCCCC" w:sz="0" w:space="0"/>
-              <w:left w:val="single" w:color="CCCCCC" w:sz="0" w:space="0"/>
-              <w:bottom w:val="single" w:color="CCCCCC" w:sz="0" w:space="0"/>
-              <w:right w:val="single" w:color="CCCCCC" w:sz="0" w:space="0"/>
-            </w:tcBorders>
-            <w:tcMar>
-              <w:top w:w="60" w:type="dxa"/>
-              <w:left w:w="100" w:type="dxa"/>
-              <w:bottom w:w="60" w:type="dxa"/>
-              <w:right w:w="100" w:type="dxa"/>
-            </w:tcMar>
-          </w:tcPr>
-          <w:p>
-            <w:pPr>
-              <w:jc w:val="left"/>
-            </w:pPr>
-            <w:r>
-              <w:rPr>
-                <w:rFonts w:ascii="Arial" w:hAnsi="Arial" w:eastAsia="Arial" w:cs="Arial"/>
-                <w:b w:val="0"/>
-                <w:bCs w:val="0"/>
-                <w:sz w:val="18"/>
-                <w:szCs w:val="18"/>
-              </w:rPr>
-              <w:t>Technically correct (raw v3.5 → calibrated v3.5 on the same 15-min corpus) but it conflates corpus and calibration effects. Tactic B matched-corpus experiment shows that at fixed 15-min corpus, the v3 architecture already reaches 0.876 °C, so Stage A/B/C delivers an additional 0.232 °C (25.4 % of the v3-to-calibrated-v3.5 total drop) — not the full 0.913 °C. Section 2.6 of this document and reports/block1_corpus_matched_comparison.csv contain the corrected attribution.</w:t>
-            </w:r>
-          </w:p>
-        </w:tc>
-      </w:tr>
-      <w:tr>
-        <w:tblPrEx>
-          <w:tblBorders>
-            <w:top w:val="single" w:color="auto" w:sz="4" w:space="0"/>
-            <w:left w:val="single" w:color="auto" w:sz="4" w:space="0"/>
-            <w:bottom w:val="single" w:color="auto" w:sz="4" w:space="0"/>
-            <w:right w:val="single" w:color="auto" w:sz="4" w:space="0"/>
-            <w:insideH w:val="single" w:color="auto" w:sz="4" w:space="0"/>
-            <w:insideV w:val="single" w:color="auto" w:sz="4" w:space="0"/>
-          </w:tblBorders>
-          <w:tblCellMar>
-            <w:top w:w="0" w:type="dxa"/>
-            <w:left w:w="10" w:type="dxa"/>
-            <w:bottom w:w="0" w:type="dxa"/>
-            <w:right w:w="10" w:type="dxa"/>
-          </w:tblCellMar>
-        </w:tblPrEx>
-        <w:tc>
-          <w:tcPr>
-            <w:tcW w:w="3700" w:type="dxa"/>
-            <w:tcBorders>
-              <w:top w:val="single" w:color="CCCCCC" w:sz="0" w:space="0"/>
-              <w:left w:val="single" w:color="CCCCCC" w:sz="0" w:space="0"/>
-              <w:bottom w:val="single" w:color="CCCCCC" w:sz="0" w:space="0"/>
-              <w:right w:val="single" w:color="CCCCCC" w:sz="0" w:space="0"/>
-            </w:tcBorders>
-            <w:shd w:val="clear" w:color="auto" w:fill="F2F7FB"/>
-            <w:tcMar>
-              <w:top w:w="60" w:type="dxa"/>
-              <w:left w:w="100" w:type="dxa"/>
-              <w:bottom w:w="60" w:type="dxa"/>
-              <w:right w:w="100" w:type="dxa"/>
-            </w:tcMar>
-          </w:tcPr>
-          <w:p>
-            <w:pPr>
-              <w:jc w:val="left"/>
-            </w:pPr>
-            <w:r>
-              <w:rPr>
-                <w:rFonts w:ascii="Arial" w:hAnsi="Arial" w:eastAsia="Arial" w:cs="Arial"/>
-                <w:b/>
-                <w:bCs/>
-                <w:sz w:val="18"/>
-                <w:szCs w:val="18"/>
-              </w:rPr>
-              <w:t>Stage B in canonical JSON shows 0 epochs</w:t>
-            </w:r>
-          </w:p>
-        </w:tc>
-        <w:tc>
-          <w:tcPr>
-            <w:tcW w:w="5660" w:type="dxa"/>
-            <w:tcBorders>
-              <w:top w:val="single" w:color="CCCCCC" w:sz="0" w:space="0"/>
-              <w:left w:val="single" w:color="CCCCCC" w:sz="0" w:space="0"/>
-              <w:bottom w:val="single" w:color="CCCCCC" w:sz="0" w:space="0"/>
-              <w:right w:val="single" w:color="CCCCCC" w:sz="0" w:space="0"/>
-            </w:tcBorders>
-            <w:shd w:val="clear" w:color="auto" w:fill="F2F7FB"/>
-            <w:tcMar>
-              <w:top w:w="60" w:type="dxa"/>
-              <w:left w:w="100" w:type="dxa"/>
-              <w:bottom w:w="60" w:type="dxa"/>
-              <w:right w:w="100" w:type="dxa"/>
-            </w:tcMar>
-          </w:tcPr>
-          <w:p>
-            <w:pPr>
-              <w:jc w:val="left"/>
-            </w:pPr>
-            <w:r>
-              <w:rPr>
-                <w:rFonts w:ascii="Arial" w:hAnsi="Arial" w:eastAsia="Arial" w:cs="Arial"/>
-                <w:b w:val="0"/>
-                <w:bCs w:val="0"/>
-                <w:sz w:val="18"/>
-                <w:szCs w:val="18"/>
-              </w:rPr>
-              <w:t>Because canonical v3.5 uses a 2-step process: C_zon was identified in the episodeaware run (120 epochs), then power_head_only loaded that C_zon and ran Stage C only on the power head.</w:t>
-            </w:r>
-          </w:p>
-        </w:tc>
-      </w:tr>
-    </w:tbl>
-    <w:p>
-      <w:pPr>
-        <w:spacing w:after="160"/>
-        <w:jc w:val="both"/>
-      </w:pPr>
-      <w:r>
-        <w:rPr>
-          <w:rFonts w:ascii="Arial" w:hAnsi="Arial" w:eastAsia="Arial" w:cs="Arial"/>
-          <w:b w:val="0"/>
-          <w:bCs w:val="0"/>
-          <w:i w:val="0"/>
-          <w:iCs w:val="0"/>
-          <w:sz w:val="22"/>
-          <w:szCs w:val="22"/>
-        </w:rPr>
-        <w:t>The corrections are mechanical (one-line edits in 03_methodology.tex) but they are factual, not stylistic. The current LaTeX draft would misrepresent the model to reviewers who try to reproduce the code.</w:t>
-      </w:r>
-    </w:p>
     <w:p>
       <w:pPr>
         <w:spacing w:before="240" w:after="120"/>
@@ -16976,7 +19083,7 @@
     <w:lsdException w:unhideWhenUsed="0" w:uiPriority="0" w:semiHidden="0" w:name="toc 8"/>
     <w:lsdException w:unhideWhenUsed="0" w:uiPriority="0" w:semiHidden="0" w:name="toc 9"/>
     <w:lsdException w:unhideWhenUsed="0" w:uiPriority="0" w:semiHidden="0" w:name="Normal Indent"/>
-    <w:lsdException w:uiPriority="99" w:name="footnote text"/>
+    <w:lsdException w:qFormat="1" w:uiPriority="99" w:name="footnote text"/>
     <w:lsdException w:unhideWhenUsed="0" w:uiPriority="0" w:semiHidden="0" w:name="annotation text"/>
     <w:lsdException w:unhideWhenUsed="0" w:uiPriority="0" w:semiHidden="0" w:name="header"/>
     <w:lsdException w:unhideWhenUsed="0" w:uiPriority="0" w:semiHidden="0" w:name="footer"/>
@@ -17266,6 +19373,7 @@
     <w:link w:val="17"/>
     <w:semiHidden/>
     <w:unhideWhenUsed/>
+    <w:qFormat/>
     <w:uiPriority w:val="99"/>
     <w:pPr>
       <w:spacing w:after="0" w:line="240" w:lineRule="auto"/>

</xml_diff>